<commit_message>
Continuación TP 1 Paradigmas
</commit_message>
<xml_diff>
--- a/PARADIGMAS DE PROGRAMACIÓN/TPs/TP 1/TP1.docx
+++ b/PARADIGMAS DE PROGRAMACIÓN/TPs/TP 1/TP1.docx
@@ -274,7 +274,7 @@
           <w:p>
             <w:r>
               <w:lastRenderedPageBreak/>
-              <w:t>FORTRAN</w:t>
+              <w:t>Fortran</w:t>
             </w:r>
           </w:p>
         </w:tc>
@@ -287,10 +287,7 @@
               <w:t xml:space="preserve">Lenguaje de </w:t>
             </w:r>
             <w:r>
-              <w:t>2°</w:t>
-            </w:r>
-            <w:r>
-              <w:t xml:space="preserve"> </w:t>
+              <w:t xml:space="preserve">2° </w:t>
             </w:r>
             <w:r>
               <w:t>generación. Su nombre es un acrónimo de “</w:t>
@@ -325,7 +322,15 @@
           </w:tcPr>
           <w:p>
             <w:r>
-              <w:t xml:space="preserve">Ni bien FORTRAN fue creado siguiendo un paradigma imperativo </w:t>
+              <w:t xml:space="preserve">Ni bien </w:t>
+            </w:r>
+            <w:r>
+              <w:t xml:space="preserve">Fortran </w:t>
+            </w:r>
+            <w:bookmarkStart w:id="0" w:name="_GoBack"/>
+            <w:bookmarkEnd w:id="0"/>
+            <w:r>
+              <w:t xml:space="preserve">fue creado siguiendo un paradigma imperativo </w:t>
             </w:r>
             <w:r>
               <w:t>procedimental</w:t>
@@ -364,10 +369,7 @@
               <w:t xml:space="preserve">de </w:t>
             </w:r>
             <w:r>
-              <w:t xml:space="preserve"> </w:t>
-            </w:r>
-            <w:r>
-              <w:t>2</w:t>
+              <w:t xml:space="preserve"> 2</w:t>
             </w:r>
             <w:proofErr w:type="gramEnd"/>
             <w:r>
@@ -406,7 +408,13 @@
           </w:tcPr>
           <w:p>
             <w:r>
-              <w:t>De forma similar a FORTRAN, COBOL comenzó siendo un sistema que seguía el paradigma</w:t>
+              <w:t xml:space="preserve">De forma similar a </w:t>
+            </w:r>
+            <w:r>
+              <w:t>Fortran</w:t>
+            </w:r>
+            <w:r>
+              <w:t>, COBOL comenzó siendo un sistema que seguía el paradigma</w:t>
             </w:r>
             <w:r>
               <w:t xml:space="preserve"> imperativo procedimental, sin embargo, se le añadieron funciones que hicieron que tome elementos de la programación orientada a objetos</w:t>
@@ -421,9 +429,11 @@
             <w:vAlign w:val="center"/>
           </w:tcPr>
           <w:p>
-            <w:r>
-              <w:t>LISP</w:t>
-            </w:r>
+            <w:proofErr w:type="spellStart"/>
+            <w:r>
+              <w:t>Lisp</w:t>
+            </w:r>
+            <w:proofErr w:type="spellEnd"/>
           </w:p>
         </w:tc>
         <w:tc>
@@ -435,13 +445,7 @@
               <w:t xml:space="preserve">Lenguaje de </w:t>
             </w:r>
             <w:r>
-              <w:t>2</w:t>
-            </w:r>
-            <w:r>
-              <w:t>°</w:t>
-            </w:r>
-            <w:r>
-              <w:t xml:space="preserve"> </w:t>
+              <w:t xml:space="preserve">2° </w:t>
             </w:r>
             <w:r>
               <w:t>gen. Su nombre es un acrónimo de “List Processor”. Fue diseñado en el MIT a finales de los 50. Como su nombre lo indica, se basa en el concepto de listas. Está basado en el cálculo lambda</w:t>
@@ -469,8 +473,13 @@
             <w:tcW w:w="1996" w:type="dxa"/>
           </w:tcPr>
           <w:p>
-            <w:r>
-              <w:t xml:space="preserve">LISP sigue un </w:t>
+            <w:proofErr w:type="spellStart"/>
+            <w:r>
+              <w:t>Lisp</w:t>
+            </w:r>
+            <w:proofErr w:type="spellEnd"/>
+            <w:r>
+              <w:t xml:space="preserve"> sigue un </w:t>
             </w:r>
             <w:r>
               <w:t>paradigma declarativo funcional.</w:t>
@@ -499,10 +508,7 @@
               <w:t xml:space="preserve">Lenguaje de </w:t>
             </w:r>
             <w:r>
-              <w:t>3°</w:t>
-            </w:r>
-            <w:r>
-              <w:t xml:space="preserve"> </w:t>
+              <w:t xml:space="preserve">3° </w:t>
             </w:r>
             <w:r>
               <w:t>generación. Su nombre deriva del inglés “Algorithmic Language”. Fue uno de los lenguajes más influyentes en la historia. Pionero en conceptos fundamentales como recursividad o el pasaje de parámetros a funciones</w:t>
@@ -531,7 +537,10 @@
           </w:tcPr>
           <w:p>
             <w:r>
-              <w:t>ALGOL es un lenguaje imperativo procedural. Tiene como particularidad que está estructurado por bloques (start - end).</w:t>
+              <w:t>ALGOL</w:t>
+            </w:r>
+            <w:r>
+              <w:t xml:space="preserve"> es un lenguaje imperativo procedural. Tiene como particularidad que está estructurado por bloques (start - end).</w:t>
             </w:r>
           </w:p>
         </w:tc>
@@ -544,52 +553,60 @@
           </w:tcPr>
           <w:p>
             <w:r>
+              <w:t>Pascal</w:t>
+            </w:r>
+          </w:p>
+        </w:tc>
+        <w:tc>
+          <w:tcPr>
+            <w:tcW w:w="2542" w:type="dxa"/>
+          </w:tcPr>
+          <w:p>
+            <w:r>
+              <w:t xml:space="preserve">Lenguaje de </w:t>
+            </w:r>
+            <w:r>
+              <w:t xml:space="preserve">3° </w:t>
+            </w:r>
+            <w:r>
+              <w:t xml:space="preserve">generación. Fue creado a </w:t>
+            </w:r>
+            <w:r>
               <w:lastRenderedPageBreak/>
-              <w:t>PASCAL</w:t>
-            </w:r>
-          </w:p>
-        </w:tc>
-        <w:tc>
-          <w:tcPr>
-            <w:tcW w:w="2542" w:type="dxa"/>
-          </w:tcPr>
-          <w:p>
-            <w:r>
-              <w:t xml:space="preserve">Lenguaje de </w:t>
-            </w:r>
-            <w:r>
-              <w:t>3°</w:t>
-            </w:r>
+              <w:t>inicios de los 70 y su nombre hace referencia al gran matemático Blaise Pascal. Presenta un control de flujo estructurado y una definición de datos muy clara, es decir, el tipo de dato de todas las variables tiene que ser declarado previamente  (fuertemente tipado).</w:t>
+            </w:r>
+          </w:p>
+        </w:tc>
+        <w:tc>
+          <w:tcPr>
+            <w:tcW w:w="2108" w:type="dxa"/>
+          </w:tcPr>
+          <w:p>
+            <w:r>
+              <w:lastRenderedPageBreak/>
+              <w:t>Pascal</w:t>
+            </w:r>
+            <w:r>
+              <w:t xml:space="preserve"> fue un leguaje destinado para la </w:t>
+            </w:r>
+            <w:r>
+              <w:lastRenderedPageBreak/>
+              <w:t xml:space="preserve">educación. Su creador, </w:t>
+            </w:r>
+            <w:proofErr w:type="spellStart"/>
+            <w:r>
+              <w:t>Niklaus</w:t>
+            </w:r>
+            <w:proofErr w:type="spellEnd"/>
             <w:r>
               <w:t xml:space="preserve"> </w:t>
             </w:r>
-            <w:r>
-              <w:t>generación. Fue creado a inicios de los 70 y su nombre hace referencia al gran matemático Blaise Pascal. Presenta un control de flujo estructurado y una definición de datos muy clara, es decir, el tipo de dato de todas las variables tiene que ser declarado previamente  (fuertemente tipado).</w:t>
-            </w:r>
-          </w:p>
-        </w:tc>
-        <w:tc>
-          <w:tcPr>
-            <w:tcW w:w="2108" w:type="dxa"/>
-          </w:tcPr>
-          <w:p>
-            <w:r>
-              <w:t xml:space="preserve">PASCAL fue un leguaje destinado para la educación. Su creador, </w:t>
-            </w:r>
             <w:proofErr w:type="spellStart"/>
             <w:r>
-              <w:t>Niklaus</w:t>
+              <w:t>Wirth</w:t>
             </w:r>
             <w:proofErr w:type="spellEnd"/>
             <w:r>
-              <w:t xml:space="preserve"> </w:t>
-            </w:r>
-            <w:proofErr w:type="spellStart"/>
-            <w:r>
-              <w:t>Wirth</w:t>
-            </w:r>
-            <w:proofErr w:type="spellEnd"/>
-            <w:r>
               <w:t xml:space="preserve"> quería un lenguaje que obligara a sus alumnos a utilizar buenas prácticas y a seguir estructuras.</w:t>
             </w:r>
           </w:p>
@@ -600,7 +617,15 @@
           </w:tcPr>
           <w:p>
             <w:r>
-              <w:t>PASCAL es un lenguaje imperativo procedimental. Tiene como característica de que es un lenguaje fuertemente tipado.</w:t>
+              <w:lastRenderedPageBreak/>
+              <w:t xml:space="preserve">Pascal </w:t>
+            </w:r>
+            <w:r>
+              <w:t xml:space="preserve">es un lenguaje </w:t>
+            </w:r>
+            <w:r>
+              <w:lastRenderedPageBreak/>
+              <w:t>imperativo procedimental. Tiene como característica de que es un lenguaje fuertemente tipado.</w:t>
             </w:r>
           </w:p>
         </w:tc>
@@ -613,7 +638,8 @@
           </w:tcPr>
           <w:p>
             <w:r>
-              <w:t>C BASIC</w:t>
+              <w:lastRenderedPageBreak/>
+              <w:t xml:space="preserve">C </w:t>
             </w:r>
           </w:p>
         </w:tc>
@@ -626,16 +652,19 @@
               <w:t xml:space="preserve">Lenguaje de </w:t>
             </w:r>
             <w:r>
-              <w:t>3°</w:t>
-            </w:r>
-            <w:r>
-              <w:t xml:space="preserve"> </w:t>
+              <w:t xml:space="preserve">3° </w:t>
             </w:r>
             <w:r>
               <w:t>generación. Creado a partir de los lenguajes BCPL y B a inicios de los 70. Es uno de los lenguajes más influyentes en la historia moderna</w:t>
             </w:r>
             <w:r>
-              <w:t>. Se caracteriza por tener un tipado más débil que el de PASCAL, por el uso intensivo de punteros y por su gran portabilidad.</w:t>
+              <w:t>. Se caracteriza por tener un tipado m</w:t>
+            </w:r>
+            <w:r>
+              <w:t>ás débil que el de Pascal</w:t>
+            </w:r>
+            <w:r>
+              <w:t>, por el uso intensivo de punteros y por su gran portabilidad.</w:t>
             </w:r>
           </w:p>
         </w:tc>
@@ -668,7 +697,7 @@
           </w:tcPr>
           <w:p>
             <w:r>
-              <w:t>ADA</w:t>
+              <w:t>Ada</w:t>
             </w:r>
           </w:p>
         </w:tc>
@@ -687,7 +716,13 @@
               <w:t xml:space="preserve"> gen. que nace a finales de los 70 a manos del Departamento de Defensa de los EE.UU. Es un lenguaje con un tipado muy fuerte </w:t>
             </w:r>
             <w:r>
-              <w:t>y con una sintaxis muy similar a la de PASCAL. Introdujo el manejo de excepciones como medidas de contingencia ante fallos.</w:t>
+              <w:t>y con una sin</w:t>
+            </w:r>
+            <w:r>
+              <w:t>taxis muy similar a la de Pascal</w:t>
+            </w:r>
+            <w:r>
+              <w:t>. Introdujo el manejo de excepciones como medidas de contingencia ante fallos.</w:t>
             </w:r>
           </w:p>
         </w:tc>
@@ -697,7 +732,10 @@
           </w:tcPr>
           <w:p>
             <w:r>
-              <w:t xml:space="preserve">ADA se usa principalmente entornos en los que se necesita una gran fiabilidad y seguridad, como la defensa, la aeronáutica o la industria aeroespacial. </w:t>
+              <w:t>Ada</w:t>
+            </w:r>
+            <w:r>
+              <w:t xml:space="preserve"> se usa principalmente entornos en los que se necesita una gran fiabilidad y seguridad, como la defensa, la aeronáutica o la industria aeroespacial. </w:t>
             </w:r>
           </w:p>
         </w:tc>
@@ -707,7 +745,10 @@
           </w:tcPr>
           <w:p>
             <w:r>
-              <w:t>ADA es un lenguaje imperativo aunque también tiene muchos elementos de la programación orientada a objetos.</w:t>
+              <w:t>Ada</w:t>
+            </w:r>
+            <w:r>
+              <w:t xml:space="preserve"> es un lenguaje imperativo aunque también tiene muchos elementos de la programación orientada a objetos.</w:t>
             </w:r>
           </w:p>
         </w:tc>
@@ -730,13 +771,7 @@
           </w:tcPr>
           <w:p>
             <w:r>
-              <w:t>Lenguaje de 4</w:t>
-            </w:r>
-            <w:r>
-              <w:t>°</w:t>
-            </w:r>
-            <w:r>
-              <w:t xml:space="preserve"> generación. Diseñado en los Laboratorios Bell a principios de los 80. Se tomó la muy sólida base de C y se le agregaron una gran cantidad de elementos relacionados con las clases y los objetos</w:t>
+              <w:t>Lenguaje de 4° generación. Diseñado en los Laboratorios Bell a principios de los 80. Se tomó la muy sólida base de C y se le agregaron una gran cantidad de elementos relacionados con las clases y los objetos</w:t>
             </w:r>
           </w:p>
         </w:tc>
@@ -810,37 +845,21 @@
           </w:tcPr>
           <w:p>
             <w:r>
+              <w:t>Java</w:t>
+            </w:r>
+          </w:p>
+        </w:tc>
+        <w:tc>
+          <w:tcPr>
+            <w:tcW w:w="2542" w:type="dxa"/>
+          </w:tcPr>
+          <w:p>
+            <w:r>
+              <w:t xml:space="preserve">Lenguaje de 4° generación. Creado a </w:t>
+            </w:r>
+            <w:r>
               <w:lastRenderedPageBreak/>
-              <w:t>JAVA</w:t>
-            </w:r>
-          </w:p>
-        </w:tc>
-        <w:tc>
-          <w:tcPr>
-            <w:tcW w:w="2542" w:type="dxa"/>
-          </w:tcPr>
-          <w:p>
-            <w:r>
-              <w:t>Lenguaje de 4° generación.</w:t>
-            </w:r>
-            <w:r>
-              <w:t xml:space="preserve"> Creado a mediados de los 90, es uno de los lenguajes más influyentes de las últimas décadas. Su slogan marca su filosofía de funcionamiento “</w:t>
-            </w:r>
-            <w:proofErr w:type="spellStart"/>
-            <w:r>
-              <w:t>code</w:t>
-            </w:r>
-            <w:proofErr w:type="spellEnd"/>
-            <w:r>
-              <w:t xml:space="preserve"> once, run </w:t>
-            </w:r>
-            <w:proofErr w:type="spellStart"/>
-            <w:r>
-              <w:t>anywhere</w:t>
-            </w:r>
-            <w:proofErr w:type="spellEnd"/>
-            <w:r>
-              <w:t>”. Es uno de los lenguajes más versátiles y adaptables de la industria</w:t>
+              <w:t>mediados de los 90, es uno de los lenguajes más influyentes de las últimas décadas. Su slogan marca su filosofía de funcionamiento “code once, run anywhere”. Es uno de los lenguajes más versátiles y adaptables de la industria</w:t>
             </w:r>
           </w:p>
         </w:tc>
@@ -850,15 +869,18 @@
           </w:tcPr>
           <w:p>
             <w:r>
-              <w:t xml:space="preserve">Definir un dominio para JAVA puede ser complicado o hasta imposible. Es un lenguaje que puede ser utilizado para desarrollar aplicaciones para el sistema operativo Android o para desarrollar el </w:t>
-            </w:r>
-            <w:proofErr w:type="spellStart"/>
-            <w:r>
-              <w:t>backend</w:t>
-            </w:r>
-            <w:proofErr w:type="spellEnd"/>
-            <w:r>
-              <w:t xml:space="preserve"> de una página web. Es un lenguaje con un domino muy amplio y con muchas áreas de aplicación</w:t>
+              <w:lastRenderedPageBreak/>
+              <w:t>Definir un dominio p</w:t>
+            </w:r>
+            <w:r>
+              <w:t>ara Java</w:t>
+            </w:r>
+            <w:r>
+              <w:t xml:space="preserve"> puede ser </w:t>
+            </w:r>
+            <w:r>
+              <w:lastRenderedPageBreak/>
+              <w:t>complicado o hasta imposible. Es un lenguaje que puede ser utilizado para desarrollar aplicaciones para el sistema operativo Android o para desarrollar el backend de una página web. Es un lenguaje con un domino muy amplio y con muchas áreas de aplicación</w:t>
             </w:r>
           </w:p>
         </w:tc>
@@ -868,7 +890,15 @@
           </w:tcPr>
           <w:p>
             <w:r>
-              <w:t>JAVA, al igual que C++ es un lenguaje multiparadigma, es imperativo, pero fuertemente orientado a objetos (suele ser la primera opción cuando se hace referencia a POO)</w:t>
+              <w:lastRenderedPageBreak/>
+              <w:t>Java</w:t>
+            </w:r>
+            <w:r>
+              <w:t xml:space="preserve">, al igual que C++ es un lenguaje </w:t>
+            </w:r>
+            <w:r>
+              <w:lastRenderedPageBreak/>
+              <w:t>multiparadigma, es imperativo, pero fuertemente orientado a objetos (suele ser la primera opción cuando se hace referencia a POO)</w:t>
             </w:r>
           </w:p>
           <w:p/>
@@ -891,7 +921,8 @@
           </w:tcPr>
           <w:p>
             <w:r>
-              <w:t>HASKELL</w:t>
+              <w:lastRenderedPageBreak/>
+              <w:t>Haskell</w:t>
             </w:r>
           </w:p>
         </w:tc>
@@ -901,36 +932,28 @@
           </w:tcPr>
           <w:p>
             <w:r>
-              <w:t>Lenguaje de 4° generación.</w:t>
-            </w:r>
-            <w:r>
-              <w:t xml:space="preserve"> Fue creado en los años 80 por un comité con el objetico de crear un lenguaje funcional moderno. Su nombre se debe al lógico </w:t>
+              <w:t xml:space="preserve">Lenguaje de 4° generación. Fue creado en los años 80 por un comité con el objetico de crear un lenguaje funcional moderno. Su nombre se debe al lógico Haskell Curry (gran aporte en el cálculo lambda). Sus características más interesantes pueden ser el soporte para tipos de datos y funciones recursivas, listas, </w:t>
             </w:r>
             <w:proofErr w:type="spellStart"/>
             <w:r>
+              <w:t>tuplas</w:t>
+            </w:r>
+            <w:proofErr w:type="spellEnd"/>
+            <w:r>
+              <w:t>, encaje de patrones, etc…</w:t>
+            </w:r>
+          </w:p>
+        </w:tc>
+        <w:tc>
+          <w:tcPr>
+            <w:tcW w:w="2108" w:type="dxa"/>
+          </w:tcPr>
+          <w:p>
+            <w:r>
               <w:t>Haskell</w:t>
             </w:r>
-            <w:proofErr w:type="spellEnd"/>
-            <w:r>
-              <w:t xml:space="preserve"> Curry (gran aporte en el cálculo lambda). Sus características más interesantes pueden ser el soporte para tipos de datos y funciones recursivas, listas, </w:t>
-            </w:r>
-            <w:proofErr w:type="spellStart"/>
-            <w:r>
-              <w:t>tuplas</w:t>
-            </w:r>
-            <w:proofErr w:type="spellEnd"/>
-            <w:r>
-              <w:t>, encaje de patrones, etc…</w:t>
-            </w:r>
-          </w:p>
-        </w:tc>
-        <w:tc>
-          <w:tcPr>
-            <w:tcW w:w="2108" w:type="dxa"/>
-          </w:tcPr>
-          <w:p>
-            <w:r>
-              <w:t>HASKELL se utiliza mucho en ámbitos académicos, sistemas de alta concurrencia, finanzas y trading (es muy confiable) y escritura de compiladores</w:t>
+            <w:r>
+              <w:t xml:space="preserve"> se utiliza mucho en ámbitos académicos, sistemas de alta concurrencia, finanzas y trading (es muy confiable) y escritura de compiladores</w:t>
             </w:r>
             <w:r>
               <w:t>.</w:t>
@@ -946,7 +969,10 @@
           </w:tcPr>
           <w:p>
             <w:r>
-              <w:t>HASKELL utiliza un paradigma declarativo funcional puro</w:t>
+              <w:t>Haskell</w:t>
+            </w:r>
+            <w:r>
+              <w:t xml:space="preserve"> utiliza un paradigma declarativo funcional puro</w:t>
             </w:r>
           </w:p>
         </w:tc>
@@ -959,7 +985,7 @@
           </w:tcPr>
           <w:p>
             <w:r>
-              <w:t>PYTHON</w:t>
+              <w:t>Python</w:t>
             </w:r>
           </w:p>
         </w:tc>
@@ -969,10 +995,7 @@
           </w:tcPr>
           <w:p>
             <w:r>
-              <w:t>Lenguaje de 4° generación.</w:t>
-            </w:r>
-            <w:r>
-              <w:t xml:space="preserve"> Es uno de los lenguajes más utilizados al día de hoy. Creado por Guido Van </w:t>
+              <w:t xml:space="preserve">Lenguaje de 4° generación. Es uno de los lenguajes más utilizados al día de hoy. Creado por Guido Van </w:t>
             </w:r>
             <w:proofErr w:type="spellStart"/>
             <w:r>
@@ -990,10 +1013,22 @@
           </w:tcPr>
           <w:p>
             <w:r>
-              <w:t xml:space="preserve">Aunque inicialmente se usaba mucho para scripting, la versatilidad de PYTHON, logró permear en multitud de usos y aplicaciones y, al igual que JAVA, es casi imposible describir un único dominio para </w:t>
-            </w:r>
-            <w:r>
-              <w:t>PYTHON</w:t>
+              <w:t xml:space="preserve">Aunque inicialmente se usaba mucho para scripting, la versatilidad de </w:t>
+            </w:r>
+            <w:r>
+              <w:t>Python</w:t>
+            </w:r>
+            <w:r>
+              <w:t xml:space="preserve">, logró permear en multitud de usos y aplicaciones y, al igual que </w:t>
+            </w:r>
+            <w:r>
+              <w:t>Java</w:t>
+            </w:r>
+            <w:r>
+              <w:t xml:space="preserve">, es casi imposible describir un único dominio para </w:t>
+            </w:r>
+            <w:r>
+              <w:t>Python</w:t>
             </w:r>
             <w:r>
               <w:t xml:space="preserve">, se utiliza en una infinidad de ámbitos, desde ciencias de datos e inteligencia artificial hasta </w:t>
@@ -1014,22 +1049,276 @@
               </w:rPr>
             </w:pPr>
             <w:r>
-              <w:t>PYTHON, al igual que otros lenguajes, es multiparadigma, ya que presenta la posibilidad de comportarse de manera imperativa, maneja los pilares de la POO y, como incluye características como funciones lambda o de orden superior, también es funcional.</w:t>
-            </w:r>
-            <w:bookmarkStart w:id="0" w:name="_GoBack"/>
-            <w:bookmarkEnd w:id="0"/>
+              <w:t>Python</w:t>
+            </w:r>
+            <w:r>
+              <w:t>, al igual que otros lenguajes, es multiparadigma, ya que presenta la posibilidad de comportarse de manera imperativa, maneja los pilares de la POO y, como incluye características como funciones lambda o de orden superior, también es funcional.</w:t>
+            </w:r>
           </w:p>
         </w:tc>
       </w:tr>
     </w:tbl>
     <w:p>
-      <w:pPr>
-        <w:ind w:left="705"/>
-      </w:pPr>
+      <w:r>
+        <w:t>Ejercicio 1.3</w:t>
+      </w:r>
+      <w:r>
+        <w:t>:</w:t>
+      </w:r>
     </w:p>
     <w:p>
-      <w:r>
-        <w:tab/>
+      <w:pPr>
+        <w:ind w:left="705"/>
+        <w:rPr>
+          <w:rFonts w:ascii="XCharter-Bold" w:hAnsi="XCharter-Bold" w:cs="XCharter-Bold"/>
+          <w:bCs/>
+          <w:sz w:val="20"/>
+          <w:szCs w:val="20"/>
+        </w:rPr>
+      </w:pPr>
+      <w:r>
+        <w:lastRenderedPageBreak/>
+        <w:t>Los lenguajes que se han basado en la arquitectura de</w:t>
+      </w:r>
+      <w:r>
+        <w:t xml:space="preserve"> máquina de</w:t>
+      </w:r>
+      <w:r>
+        <w:t xml:space="preserve"> Von Neumann son, en su gran mayoría</w:t>
+      </w:r>
+      <w:r>
+        <w:rPr>
+          <w:rFonts w:ascii="XCharter-Bold" w:hAnsi="XCharter-Bold" w:cs="XCharter-Bold"/>
+          <w:b/>
+          <w:bCs/>
+          <w:sz w:val="20"/>
+          <w:szCs w:val="20"/>
+        </w:rPr>
+        <w:t xml:space="preserve"> </w:t>
+      </w:r>
+      <w:r>
+        <w:rPr>
+          <w:rFonts w:ascii="XCharter-Bold" w:hAnsi="XCharter-Bold" w:cs="XCharter-Bold"/>
+          <w:bCs/>
+          <w:sz w:val="20"/>
+          <w:szCs w:val="20"/>
+        </w:rPr>
+        <w:t xml:space="preserve">los lenguajes imperativos (como C, PASCAL o ALGOL). En una computadora que sigue esta arquitectura tanto los datos como los programas se almacenan en la misma unidad de memoria y, como el CPU está separado de esta, las instrucciones y datos deben ser trasmitidos de la memoria al CPU. Los resultados que el procesador arroje deben ser devueltos a la memoria. </w:t>
+      </w:r>
+    </w:p>
+    <w:p>
+      <w:pPr>
+        <w:ind w:left="705"/>
+      </w:pPr>
+      <w:r>
+        <w:drawing>
+          <wp:inline distT="0" distB="0" distL="0" distR="0" wp14:anchorId="4416A086" wp14:editId="7C1B4969">
+            <wp:extent cx="5400040" cy="3347720"/>
+            <wp:effectExtent l="0" t="0" r="0" b="5080"/>
+            <wp:docPr id="1" name="Imagen 1"/>
+            <wp:cNvGraphicFramePr>
+              <a:graphicFrameLocks xmlns:a="http://schemas.openxmlformats.org/drawingml/2006/main" noChangeAspect="1"/>
+            </wp:cNvGraphicFramePr>
+            <a:graphic xmlns:a="http://schemas.openxmlformats.org/drawingml/2006/main">
+              <a:graphicData uri="http://schemas.openxmlformats.org/drawingml/2006/picture">
+                <pic:pic xmlns:pic="http://schemas.openxmlformats.org/drawingml/2006/picture">
+                  <pic:nvPicPr>
+                    <pic:cNvPr id="1" name=""/>
+                    <pic:cNvPicPr/>
+                  </pic:nvPicPr>
+                  <pic:blipFill>
+                    <a:blip r:embed="rId5"/>
+                    <a:stretch>
+                      <a:fillRect/>
+                    </a:stretch>
+                  </pic:blipFill>
+                  <pic:spPr>
+                    <a:xfrm>
+                      <a:off x="0" y="0"/>
+                      <a:ext cx="5400040" cy="3347720"/>
+                    </a:xfrm>
+                    <a:prstGeom prst="rect">
+                      <a:avLst/>
+                    </a:prstGeom>
+                  </pic:spPr>
+                </pic:pic>
+              </a:graphicData>
+            </a:graphic>
+          </wp:inline>
+        </w:drawing>
+      </w:r>
+    </w:p>
+    <w:p>
+      <w:pPr>
+        <w:ind w:left="705"/>
+      </w:pPr>
+      <w:r>
+        <w:t>Debido a la arquitectura de Von Neumann, la función central o más característica de los lenguajes imperativos son las variables, que modelan las celdas de memoria.</w:t>
+      </w:r>
+    </w:p>
+    <w:p>
+      <w:pPr>
+        <w:ind w:left="705"/>
+      </w:pPr>
+      <w:r>
+        <w:t xml:space="preserve">Los lenguajes funcionales no siguen </w:t>
+      </w:r>
+      <w:r>
+        <w:t>una estructura en los que los estados cambian de forma tan dinámica. Su objetivo es parecerse los más posible y representar de la mejor manera posible el álgebra matemática, para esta finalidad, la arquitectura de Von Neumann resulta más un limitante que una ayuda.</w:t>
+      </w:r>
+    </w:p>
+    <w:p>
+      <w:pPr>
+        <w:ind w:left="705"/>
+      </w:pPr>
+    </w:p>
+    <w:p>
+      <w:r>
+        <w:t>Ejercicio 1.4</w:t>
+      </w:r>
+      <w:r>
+        <w:t>:</w:t>
+      </w:r>
+    </w:p>
+    <w:p>
+      <w:pPr>
+        <w:ind w:left="705"/>
+      </w:pPr>
+      <w:r>
+        <w:t>Sebe</w:t>
+      </w:r>
+      <w:r>
+        <w:t>sta argumenta que los lenguajes muy grandes o complejos suelen tener redundancias a la hora de realizar una misma tarea</w:t>
+      </w:r>
+      <w:r>
+        <w:t xml:space="preserve"> (e</w:t>
+      </w:r>
+      <w:r>
+        <w:t>n Java</w:t>
+      </w:r>
+      <w:r>
+        <w:t xml:space="preserve">, por ejemplo, para aumentar un contador existen 4 formas distintas de hacerlo: </w:t>
+      </w:r>
+      <w:proofErr w:type="spellStart"/>
+      <w:r>
+        <w:t>count</w:t>
+      </w:r>
+      <w:proofErr w:type="spellEnd"/>
+      <w:r>
+        <w:t xml:space="preserve"> = </w:t>
+      </w:r>
+      <w:proofErr w:type="spellStart"/>
+      <w:r>
+        <w:t>count</w:t>
+      </w:r>
+      <w:proofErr w:type="spellEnd"/>
+      <w:r>
+        <w:t xml:space="preserve"> +1, </w:t>
+      </w:r>
+      <w:proofErr w:type="spellStart"/>
+      <w:r>
+        <w:t>count</w:t>
+      </w:r>
+      <w:proofErr w:type="spellEnd"/>
+      <w:r>
+        <w:t xml:space="preserve"> += 1, </w:t>
+      </w:r>
+      <w:proofErr w:type="spellStart"/>
+      <w:r>
+        <w:t>count</w:t>
+      </w:r>
+      <w:proofErr w:type="spellEnd"/>
+      <w:r>
+        <w:t>++ y ++</w:t>
+      </w:r>
+      <w:proofErr w:type="spellStart"/>
+      <w:r>
+        <w:t>count</w:t>
+      </w:r>
+      <w:proofErr w:type="spellEnd"/>
+      <w:r>
+        <w:t>) complicando así la lectura del código, ya que obliga a los programadores a aprender todas las nomenclaturas para no encontrarse con código ilegible para ellos. También opina que los lenguajes demasiados complejos o con demasiadas funcionalidades son más propensos al error humano debido a la limitada capacidad del mismo a estar atento o pendiente a tantas cosas al mismo tiempo</w:t>
+      </w:r>
+      <w:r>
+        <w:t>. Sebe</w:t>
+      </w:r>
+      <w:r>
+        <w:t xml:space="preserve">sta prefiere la simplicidad y la </w:t>
+      </w:r>
+      <w:proofErr w:type="spellStart"/>
+      <w:r>
+        <w:t>ortogonalidad</w:t>
+      </w:r>
+      <w:proofErr w:type="spellEnd"/>
+      <w:r>
+        <w:t xml:space="preserve"> (pocas reglas que interactúen de forma predecible) en los lenguajes, son más fáciles de leer y de trabajar con ellos.</w:t>
+      </w:r>
+    </w:p>
+    <w:p>
+      <w:pPr>
+        <w:ind w:left="705"/>
+      </w:pPr>
+      <w:r>
+        <w:t>Por otro lado, Michael Scott tiene una visión más pragmática del tema. Él considera que lenguajes demasiado simples (</w:t>
+      </w:r>
+      <w:r>
+        <w:t>como Fortran o Basic</w:t>
+      </w:r>
+      <w:r>
+        <w:t xml:space="preserve">) pueden ser tediosos y </w:t>
+      </w:r>
+      <w:r>
+        <w:lastRenderedPageBreak/>
+        <w:t>frustrantes a la hora de realizar programas más complejos, aunque los lenguajes demasiado complejos (</w:t>
+      </w:r>
+      <w:r>
+        <w:t>como Ada</w:t>
+      </w:r>
+      <w:r>
+        <w:t xml:space="preserve"> o C++) pueden generar herramientas lentas o con errores. Para Scott, el debate no es la cantidad de características que un lenguaje pueda tener, sino </w:t>
+      </w:r>
+      <w:r>
+        <w:t>cuán eficientes son estas características a la hora de facilitar al desarrollador la abstracción del problema.</w:t>
+      </w:r>
+    </w:p>
+    <w:p>
+      <w:pPr>
+        <w:ind w:left="705"/>
+      </w:pPr>
+      <w:r>
+        <w:t xml:space="preserve">Personalmente, creo que con el creciente desarrollo de herramientas de IA, los lenguajes grandes y complejos son cada vez más accesibles y lenguajes </w:t>
+      </w:r>
+      <w:proofErr w:type="spellStart"/>
+      <w:r>
+        <w:t>multi</w:t>
+      </w:r>
+      <w:proofErr w:type="spellEnd"/>
+      <w:r>
+        <w:t xml:space="preserve">-propósito como PYTHON están encontrando un lugar en la comunidad. Sin embargo, yo prefiero la idea de desarrollar lenguajes con funciones específicas, que funcionen muy bien en su nicho. Pienso que no se debería caer en el famoso dicho en inglés: “Jack of </w:t>
+      </w:r>
+      <w:proofErr w:type="spellStart"/>
+      <w:r>
+        <w:t>all</w:t>
+      </w:r>
+      <w:proofErr w:type="spellEnd"/>
+      <w:r>
+        <w:t xml:space="preserve"> </w:t>
+      </w:r>
+      <w:proofErr w:type="spellStart"/>
+      <w:r>
+        <w:t>trades</w:t>
+      </w:r>
+      <w:proofErr w:type="spellEnd"/>
+      <w:r>
+        <w:t xml:space="preserve">, master of </w:t>
+      </w:r>
+      <w:proofErr w:type="spellStart"/>
+      <w:r>
+        <w:t>none</w:t>
+      </w:r>
+      <w:proofErr w:type="spellEnd"/>
+      <w:r>
+        <w:t>”. Creo firmemente que los productos destinados y diseñados con una función en específico van a ser extremadamente eficientes en su área, en comparación a otros que intenten abarcar la mayor cantidad de espacios o dominios.</w:t>
       </w:r>
     </w:p>
     <w:sectPr>
@@ -1672,10 +1961,12 @@
   <w:style w:type="paragraph" w:default="1" w:styleId="Normal">
     <w:name w:val="Normal"/>
     <w:qFormat/>
+    <w:rsid w:val="00862A33"/>
   </w:style>
   <w:style w:type="character" w:default="1" w:styleId="Fuentedeprrafopredeter">
     <w:name w:val="Default Paragraph Font"/>
     <w:uiPriority w:val="1"/>
+    <w:semiHidden/>
     <w:unhideWhenUsed/>
   </w:style>
   <w:style w:type="table" w:default="1" w:styleId="Tablanormal">

</xml_diff>

<commit_message>
Finalización TP 1 Paradigmas de la programación (Desktop)
</commit_message>
<xml_diff>
--- a/PARADIGMAS DE PROGRAMACIÓN/TPs/TP 1/TP1.docx
+++ b/PARADIGMAS DE PROGRAMACIÓN/TPs/TP 1/TP1.docx
@@ -327,8 +327,6 @@
             <w:r>
               <w:t xml:space="preserve">Fortran </w:t>
             </w:r>
-            <w:bookmarkStart w:id="0" w:name="_GoBack"/>
-            <w:bookmarkEnd w:id="0"/>
             <w:r>
               <w:t xml:space="preserve">fue creado siguiendo un paradigma imperativo </w:t>
             </w:r>
@@ -1058,12 +1056,10 @@
         </w:tc>
       </w:tr>
     </w:tbl>
-    <w:p>
-      <w:r>
-        <w:t>Ejercicio 1.3</w:t>
-      </w:r>
-      <w:r>
-        <w:t>:</w:t>
+    <w:p/>
+    <w:p>
+      <w:r>
+        <w:t>Ejercicio 1.3:</w:t>
       </w:r>
     </w:p>
     <w:p>
@@ -1103,7 +1099,25 @@
           <w:sz w:val="20"/>
           <w:szCs w:val="20"/>
         </w:rPr>
-        <w:t xml:space="preserve">los lenguajes imperativos (como C, PASCAL o ALGOL). En una computadora que sigue esta arquitectura tanto los datos como los programas se almacenan en la misma unidad de memoria y, como el CPU está separado de esta, las instrucciones y datos deben ser trasmitidos de la memoria al CPU. Los resultados que el procesador arroje deben ser devueltos a la memoria. </w:t>
+        <w:t>los lengu</w:t>
+      </w:r>
+      <w:r>
+        <w:rPr>
+          <w:rFonts w:ascii="XCharter-Bold" w:hAnsi="XCharter-Bold" w:cs="XCharter-Bold"/>
+          <w:bCs/>
+          <w:sz w:val="20"/>
+          <w:szCs w:val="20"/>
+        </w:rPr>
+        <w:t>ajes imperativos (como C, Pascal</w:t>
+      </w:r>
+      <w:r>
+        <w:rPr>
+          <w:rFonts w:ascii="XCharter-Bold" w:hAnsi="XCharter-Bold" w:cs="XCharter-Bold"/>
+          <w:bCs/>
+          <w:sz w:val="20"/>
+          <w:szCs w:val="20"/>
+        </w:rPr>
+        <w:t xml:space="preserve"> o ALGOL). En una computadora que sigue esta arquitectura tanto los datos como los programas se almacenan en la misma unidad de memoria y, como el CPU está separado de esta, las instrucciones y datos deben ser trasmitidos de la memoria al CPU. Los resultados que el procesador arroje deben ser devueltos a la memoria. </w:t>
       </w:r>
     </w:p>
     <w:p>
@@ -1111,6 +1125,10 @@
         <w:ind w:left="705"/>
       </w:pPr>
       <w:r>
+        <w:rPr>
+          <w:noProof/>
+          <w:lang w:eastAsia="es-419"/>
+        </w:rPr>
         <w:drawing>
           <wp:inline distT="0" distB="0" distL="0" distR="0" wp14:anchorId="4416A086" wp14:editId="7C1B4969">
             <wp:extent cx="5400040" cy="3347720"/>
@@ -1174,10 +1192,7 @@
     </w:p>
     <w:p>
       <w:r>
-        <w:t>Ejercicio 1.4</w:t>
-      </w:r>
-      <w:r>
-        <w:t>:</w:t>
+        <w:t>Ejercicio 1.4:</w:t>
       </w:r>
     </w:p>
     <w:p>
@@ -1294,7 +1309,13 @@
       </w:r>
       <w:proofErr w:type="spellEnd"/>
       <w:r>
-        <w:t xml:space="preserve">-propósito como PYTHON están encontrando un lugar en la comunidad. Sin embargo, yo prefiero la idea de desarrollar lenguajes con funciones específicas, que funcionen muy bien en su nicho. Pienso que no se debería caer en el famoso dicho en inglés: “Jack of </w:t>
+        <w:t>-propósito como</w:t>
+      </w:r>
+      <w:r>
+        <w:t xml:space="preserve"> Python</w:t>
+      </w:r>
+      <w:r>
+        <w:t xml:space="preserve"> están encontrando un lugar en la comunidad. Sin embargo, yo prefiero la idea de desarrollar lenguajes con funciones específicas, que funcionen muy bien en su nicho. Pienso que no se debería caer en el famoso dicho en inglés: “Jack of </w:t>
       </w:r>
       <w:proofErr w:type="spellStart"/>
       <w:r>
@@ -1319,6 +1340,1673 @@
       <w:proofErr w:type="spellEnd"/>
       <w:r>
         <w:t>”. Creo firmemente que los productos destinados y diseñados con una función en específico van a ser extremadamente eficientes en su área, en comparación a otros que intenten abarcar la mayor cantidad de espacios o dominios.</w:t>
+      </w:r>
+    </w:p>
+    <w:p>
+      <w:pPr>
+        <w:ind w:left="705"/>
+      </w:pPr>
+    </w:p>
+    <w:p>
+      <w:r>
+        <w:t>Ejercicio 1.5:</w:t>
+      </w:r>
+    </w:p>
+    <w:p>
+      <w:pPr>
+        <w:pStyle w:val="Prrafodelista"/>
+        <w:numPr>
+          <w:ilvl w:val="0"/>
+          <w:numId w:val="3"/>
+        </w:numPr>
+      </w:pPr>
+      <w:r>
+        <w:t xml:space="preserve">Fortran: Es un lenguaje que </w:t>
+      </w:r>
+      <w:r>
+        <w:t xml:space="preserve">es altamente eficiente y rápido en operaciones matemáticas (incluso más que C o C++ debido a la falta de </w:t>
+      </w:r>
+      <w:proofErr w:type="spellStart"/>
+      <w:r>
+        <w:t>aliasing</w:t>
+      </w:r>
+      <w:proofErr w:type="spellEnd"/>
+      <w:r>
+        <w:t>, punteros que apuntan a la misma posición de memoria). La computación ha sido dominada por Fortran durante más de 60 años debido a que las aplicaciones científicas requieren grandes cantidades de operaciones de punto flotante.</w:t>
+      </w:r>
+    </w:p>
+    <w:p>
+      <w:pPr>
+        <w:pStyle w:val="Prrafodelista"/>
+      </w:pPr>
+      <w:r>
+        <w:t xml:space="preserve">Se usa principalmente en ámbitos que requieren alto rendimiento como: </w:t>
+      </w:r>
+    </w:p>
+    <w:p>
+      <w:pPr>
+        <w:pStyle w:val="Prrafodelista"/>
+        <w:numPr>
+          <w:ilvl w:val="1"/>
+          <w:numId w:val="3"/>
+        </w:numPr>
+      </w:pPr>
+      <w:r>
+        <w:t>Simulaciones climáticas.</w:t>
+      </w:r>
+    </w:p>
+    <w:p>
+      <w:pPr>
+        <w:pStyle w:val="Prrafodelista"/>
+        <w:numPr>
+          <w:ilvl w:val="1"/>
+          <w:numId w:val="3"/>
+        </w:numPr>
+      </w:pPr>
+      <w:r>
+        <w:t>Física y química computacional.</w:t>
+      </w:r>
+    </w:p>
+    <w:p>
+      <w:pPr>
+        <w:pStyle w:val="Prrafodelista"/>
+        <w:numPr>
+          <w:ilvl w:val="1"/>
+          <w:numId w:val="3"/>
+        </w:numPr>
+      </w:pPr>
+      <w:r>
+        <w:t>Ingeniería aeroespacial.</w:t>
+      </w:r>
+    </w:p>
+    <w:p>
+      <w:pPr>
+        <w:pStyle w:val="Prrafodelista"/>
+        <w:ind w:left="1440"/>
+      </w:pPr>
+    </w:p>
+    <w:p>
+      <w:pPr>
+        <w:pStyle w:val="Prrafodelista"/>
+        <w:numPr>
+          <w:ilvl w:val="0"/>
+          <w:numId w:val="3"/>
+        </w:numPr>
+      </w:pPr>
+      <w:r>
+        <w:t xml:space="preserve">C: Este lenguaje tiene un manejo del hardware muy </w:t>
+      </w:r>
+      <w:r>
+        <w:t xml:space="preserve">elevado, principalmente por sus punteros y capacidad de referenciar a posiciones de memoria individuales y diferenciadas, tal es así que algunos autores lo consideran de bajo nivel. Por estos motivos (además de su simplicidad) es el lenguaje ideal para basar los </w:t>
+      </w:r>
+      <w:proofErr w:type="spellStart"/>
+      <w:r>
+        <w:t>kernel</w:t>
+      </w:r>
+      <w:proofErr w:type="spellEnd"/>
+      <w:r>
+        <w:t xml:space="preserve"> de los sistemas operativos (cómo Linux, Windows o </w:t>
+      </w:r>
+      <w:proofErr w:type="spellStart"/>
+      <w:r>
+        <w:t>macOS</w:t>
+      </w:r>
+      <w:proofErr w:type="spellEnd"/>
+      <w:r>
+        <w:t>), para desarrollar sistemas embebidos o drivers y compiladores.</w:t>
+      </w:r>
+    </w:p>
+    <w:p>
+      <w:pPr>
+        <w:pStyle w:val="Prrafodelista"/>
+      </w:pPr>
+    </w:p>
+    <w:p>
+      <w:pPr>
+        <w:pStyle w:val="Prrafodelista"/>
+        <w:numPr>
+          <w:ilvl w:val="0"/>
+          <w:numId w:val="3"/>
+        </w:numPr>
+      </w:pPr>
+      <w:r>
+        <w:t xml:space="preserve">C++: Este </w:t>
+      </w:r>
+      <w:r>
+        <w:t xml:space="preserve">lenguaje es </w:t>
+      </w:r>
+      <w:proofErr w:type="gramStart"/>
+      <w:r>
+        <w:t>C</w:t>
+      </w:r>
+      <w:proofErr w:type="gramEnd"/>
+      <w:r>
+        <w:t xml:space="preserve"> pero vitaminado, adquiere un gran abanico de funciones que le abren muchas posibilidades (como la capacidad de usar objetos) y le brindan un número de aplicaciones que su hermano menor no posee. El lenguaje, sin embargo, no reemplazó a C en sus dominios de aplicación debido, principalmente a la complejidad de C++ versus la simpleza de su predecesor. Los dominios en los que C++ encontró utilidad son los que necesitan eficiencia, rapidez, pero sobre todo una complejidad suficiente como para que su contraparte menos capaz deje de ser suficiente. Estos dominios pueden ser: </w:t>
+      </w:r>
+    </w:p>
+    <w:p>
+      <w:pPr>
+        <w:pStyle w:val="Prrafodelista"/>
+        <w:numPr>
+          <w:ilvl w:val="1"/>
+          <w:numId w:val="3"/>
+        </w:numPr>
+      </w:pPr>
+      <w:r>
+        <w:t>Motores de videojuegos.</w:t>
+      </w:r>
+    </w:p>
+    <w:p>
+      <w:pPr>
+        <w:pStyle w:val="Prrafodelista"/>
+        <w:numPr>
+          <w:ilvl w:val="1"/>
+          <w:numId w:val="3"/>
+        </w:numPr>
+      </w:pPr>
+      <w:r>
+        <w:t xml:space="preserve">Motores de </w:t>
+      </w:r>
+      <w:proofErr w:type="spellStart"/>
+      <w:r>
+        <w:t>renderizado</w:t>
+      </w:r>
+      <w:proofErr w:type="spellEnd"/>
+      <w:r>
+        <w:t xml:space="preserve"> de navegadores web.</w:t>
+      </w:r>
+    </w:p>
+    <w:p>
+      <w:pPr>
+        <w:pStyle w:val="Prrafodelista"/>
+        <w:numPr>
+          <w:ilvl w:val="1"/>
+          <w:numId w:val="3"/>
+        </w:numPr>
+      </w:pPr>
+      <w:r>
+        <w:t>Software de diseño y edición.</w:t>
+      </w:r>
+    </w:p>
+    <w:p>
+      <w:pPr>
+        <w:pStyle w:val="Prrafodelista"/>
+        <w:numPr>
+          <w:ilvl w:val="1"/>
+          <w:numId w:val="3"/>
+        </w:numPr>
+      </w:pPr>
+      <w:r>
+        <w:t>Sistemas financieros.</w:t>
+      </w:r>
+    </w:p>
+    <w:p>
+      <w:pPr>
+        <w:ind w:left="720"/>
+      </w:pPr>
+    </w:p>
+    <w:p>
+      <w:pPr>
+        <w:ind w:left="720"/>
+      </w:pPr>
+    </w:p>
+    <w:p>
+      <w:r>
+        <w:t>Ejercicio 1.6:</w:t>
+      </w:r>
+    </w:p>
+    <w:p>
+      <w:r>
+        <w:tab/>
+        <w:t>En este punto se omitirán los lenguajes C y C++ (1.5)</w:t>
+      </w:r>
+    </w:p>
+    <w:p>
+      <w:pPr>
+        <w:pStyle w:val="Prrafodelista"/>
+        <w:numPr>
+          <w:ilvl w:val="0"/>
+          <w:numId w:val="11"/>
+        </w:numPr>
+      </w:pPr>
+      <w:r>
+        <w:t>Go (</w:t>
+      </w:r>
+      <w:proofErr w:type="spellStart"/>
+      <w:r>
+        <w:t>Golang</w:t>
+      </w:r>
+      <w:proofErr w:type="spellEnd"/>
+      <w:r>
+        <w:t>): Este lenguaje fue creado por Google</w:t>
+      </w:r>
+      <w:r>
+        <w:t xml:space="preserve"> en el 2009, imperativo, </w:t>
+      </w:r>
+      <w:r>
+        <w:t>es</w:t>
+      </w:r>
+      <w:r>
+        <w:t xml:space="preserve">tructurado, concurrente </w:t>
+      </w:r>
+      <w:r>
+        <w:t xml:space="preserve">y de tipado estático. Fue creado para resolver algunas problemáticas del gigante, como, por ejemplo: sistemas masivos, distribuidos y con miles de programadores trabajando en el mismo código. </w:t>
+      </w:r>
+      <w:r>
+        <w:t xml:space="preserve">Go tiene la peculiaridad de ser un lenguaje muy eficiente y rápido (comparable con C o C++), pero sin sacrificar la seguridad, por lo que encuentra muchas aplicaciones en el “internet of </w:t>
+      </w:r>
+      <w:proofErr w:type="spellStart"/>
+      <w:r>
+        <w:t>things</w:t>
+      </w:r>
+      <w:proofErr w:type="spellEnd"/>
+      <w:r>
+        <w:t xml:space="preserve">”. La razón de este balance entre seguridad y rapidez reside en como Go maneja los punteros, o, mejor dicho, no lo hace. No tiene una aritmética de punteros, la razón de su seguridad. Sin aritmética de punteros es posible crear un lenguaje en el que no se pueda obtener una dirección ilegal que sea usada de forma incorrecta. La falta de aritmética de punteros simplifica la implementación del recolector de basura. Además, optimizando el hardware actual, un bucle que utiliza los índices de un </w:t>
+      </w:r>
+      <w:proofErr w:type="spellStart"/>
+      <w:r>
+        <w:t>array</w:t>
+      </w:r>
+      <w:proofErr w:type="spellEnd"/>
+      <w:r>
+        <w:t xml:space="preserve"> puede ser tan eficaz como un bucle que utiliza aritmética de punteros. Sus dominios suelen ser: </w:t>
+      </w:r>
+    </w:p>
+    <w:p>
+      <w:pPr>
+        <w:pStyle w:val="Prrafodelista"/>
+        <w:numPr>
+          <w:ilvl w:val="1"/>
+          <w:numId w:val="10"/>
+        </w:numPr>
+      </w:pPr>
+      <w:r>
+        <w:t xml:space="preserve">Servicios web y </w:t>
+      </w:r>
+      <w:proofErr w:type="spellStart"/>
+      <w:r>
+        <w:t>microservicios</w:t>
+      </w:r>
+      <w:proofErr w:type="spellEnd"/>
+      <w:r>
+        <w:t xml:space="preserve"> (backend de </w:t>
+      </w:r>
+      <w:proofErr w:type="spellStart"/>
+      <w:r>
+        <w:t>Twitch</w:t>
+      </w:r>
+      <w:proofErr w:type="spellEnd"/>
+      <w:r>
+        <w:t xml:space="preserve">, Uber y </w:t>
+      </w:r>
+      <w:proofErr w:type="spellStart"/>
+      <w:r>
+        <w:t>Netflix</w:t>
+      </w:r>
+      <w:proofErr w:type="spellEnd"/>
+      <w:r>
+        <w:t>).</w:t>
+      </w:r>
+    </w:p>
+    <w:p>
+      <w:pPr>
+        <w:pStyle w:val="Prrafodelista"/>
+        <w:numPr>
+          <w:ilvl w:val="1"/>
+          <w:numId w:val="10"/>
+        </w:numPr>
+      </w:pPr>
+      <w:r>
+        <w:t xml:space="preserve">Infraestructura y herramientas </w:t>
+      </w:r>
+      <w:proofErr w:type="spellStart"/>
+      <w:r>
+        <w:t>DevOps</w:t>
+      </w:r>
+      <w:proofErr w:type="spellEnd"/>
+      <w:r>
+        <w:t xml:space="preserve"> (</w:t>
+      </w:r>
+      <w:proofErr w:type="spellStart"/>
+      <w:r>
+        <w:t>Docker</w:t>
+      </w:r>
+      <w:proofErr w:type="spellEnd"/>
+      <w:r>
+        <w:t xml:space="preserve"> y </w:t>
+      </w:r>
+      <w:proofErr w:type="spellStart"/>
+      <w:r>
+        <w:t>Kubernetes</w:t>
+      </w:r>
+      <w:proofErr w:type="spellEnd"/>
+      <w:r>
+        <w:t>).</w:t>
+      </w:r>
+    </w:p>
+    <w:p>
+      <w:pPr>
+        <w:pStyle w:val="Prrafodelista"/>
+        <w:numPr>
+          <w:ilvl w:val="1"/>
+          <w:numId w:val="10"/>
+        </w:numPr>
+      </w:pPr>
+      <w:r>
+        <w:t>Redes y sistemas distribuidos.</w:t>
+      </w:r>
+    </w:p>
+    <w:p>
+      <w:pPr>
+        <w:pStyle w:val="Prrafodelista"/>
+        <w:ind w:left="1670"/>
+      </w:pPr>
+    </w:p>
+    <w:p>
+      <w:pPr>
+        <w:pStyle w:val="Prrafodelista"/>
+        <w:numPr>
+          <w:ilvl w:val="0"/>
+          <w:numId w:val="10"/>
+        </w:numPr>
+      </w:pPr>
+      <w:r>
+        <w:t xml:space="preserve">Haskell: </w:t>
+      </w:r>
+      <w:r>
+        <w:t xml:space="preserve">Es uno de los pocos lenguajes funcionales puros (no permite efectos secundarios). Una función en Haskell es una función matemática: para una misma entrada, siempre, sin excepción, dará la misma salida. Tiene un tipado estático y fuerte, el compilador es extremadamente riguroso. Si el programa compila, es muy probable que sea correcto (si compila, funciona). En Haskell no existen las variables tradicionales, una vez se asigna </w:t>
+      </w:r>
+      <w:r>
+        <w:t xml:space="preserve">un valor a un nombre, ese valor no cambia nunca. Para “cambiar” algo, se crea un nuevo dato basado en el anterior. Estas características le dan a Haskell una idoneidad para: </w:t>
+      </w:r>
+    </w:p>
+    <w:p>
+      <w:pPr>
+        <w:pStyle w:val="Prrafodelista"/>
+        <w:numPr>
+          <w:ilvl w:val="1"/>
+          <w:numId w:val="10"/>
+        </w:numPr>
+      </w:pPr>
+      <w:r>
+        <w:t>Investigación y academia.</w:t>
+      </w:r>
+    </w:p>
+    <w:p>
+      <w:pPr>
+        <w:pStyle w:val="Prrafodelista"/>
+        <w:numPr>
+          <w:ilvl w:val="1"/>
+          <w:numId w:val="10"/>
+        </w:numPr>
+      </w:pPr>
+      <w:r>
+        <w:t>Sistemas de alta concurrencia (no hay estados globales, es excelente para procesar muchas tareas en paralelo sin errores de memoria)</w:t>
+      </w:r>
+    </w:p>
+    <w:p>
+      <w:pPr>
+        <w:pStyle w:val="Prrafodelista"/>
+        <w:numPr>
+          <w:ilvl w:val="1"/>
+          <w:numId w:val="10"/>
+        </w:numPr>
+      </w:pPr>
+      <w:r>
+        <w:t>Finanzas y criptografía (</w:t>
+      </w:r>
+      <w:proofErr w:type="spellStart"/>
+      <w:r>
+        <w:t>blockchain</w:t>
+      </w:r>
+      <w:proofErr w:type="spellEnd"/>
+      <w:r>
+        <w:t>)</w:t>
+      </w:r>
+    </w:p>
+    <w:p>
+      <w:pPr>
+        <w:pStyle w:val="Prrafodelista"/>
+        <w:numPr>
+          <w:ilvl w:val="1"/>
+          <w:numId w:val="10"/>
+        </w:numPr>
+      </w:pPr>
+      <w:r>
+        <w:t>Escritura de compiladores (como, por ejemplo, el compilador de Rust)</w:t>
+      </w:r>
+    </w:p>
+    <w:p>
+      <w:pPr>
+        <w:pStyle w:val="Prrafodelista"/>
+        <w:ind w:left="1670"/>
+      </w:pPr>
+    </w:p>
+    <w:p>
+      <w:pPr>
+        <w:pStyle w:val="Prrafodelista"/>
+        <w:numPr>
+          <w:ilvl w:val="0"/>
+          <w:numId w:val="10"/>
+        </w:numPr>
+      </w:pPr>
+      <w:r>
+        <w:t>Java: Java es un clásico de la industria, es un lenguaje que lleva años entre nosotros y esto ha conllevado una evolución natural del leguaje. Sus principales fortalezas son la portabilidad que maneja (al ejecutarse en máquinas virtuales, puede correr prácticamente en cualquier hardware)</w:t>
+      </w:r>
+      <w:r>
+        <w:t xml:space="preserve">, </w:t>
+      </w:r>
+      <w:r>
+        <w:t>lo plurivalente y completo que es el lenguaje</w:t>
+      </w:r>
+      <w:r>
+        <w:t xml:space="preserve"> y la capacidad de manejar de manera eficiente varios hilos de ejecución</w:t>
+      </w:r>
+      <w:r>
+        <w:t xml:space="preserve">. Su principal </w:t>
+      </w:r>
+      <w:r>
+        <w:t xml:space="preserve">desventaja es su verborrea y lo poco eficiente que es al lado de otros lenguajes como C++ o Go. Con el tiempo, ha conquistado dominios de infraestructura masiva: </w:t>
+      </w:r>
+    </w:p>
+    <w:p>
+      <w:pPr>
+        <w:pStyle w:val="Prrafodelista"/>
+        <w:numPr>
+          <w:ilvl w:val="1"/>
+          <w:numId w:val="10"/>
+        </w:numPr>
+      </w:pPr>
+      <w:r>
+        <w:t>Sistemas empresariales y bancarios (backend/</w:t>
+      </w:r>
+      <w:proofErr w:type="spellStart"/>
+      <w:r>
+        <w:t>ATMs</w:t>
+      </w:r>
+      <w:proofErr w:type="spellEnd"/>
+      <w:r>
+        <w:t>).</w:t>
+      </w:r>
+    </w:p>
+    <w:p>
+      <w:pPr>
+        <w:pStyle w:val="Prrafodelista"/>
+        <w:numPr>
+          <w:ilvl w:val="1"/>
+          <w:numId w:val="10"/>
+        </w:numPr>
+      </w:pPr>
+      <w:r>
+        <w:t xml:space="preserve">Big data y procesamiento de datos (Apache, </w:t>
+      </w:r>
+      <w:proofErr w:type="spellStart"/>
+      <w:r>
+        <w:t>Hadoop</w:t>
+      </w:r>
+      <w:proofErr w:type="spellEnd"/>
+      <w:r>
+        <w:t xml:space="preserve">, </w:t>
+      </w:r>
+      <w:proofErr w:type="spellStart"/>
+      <w:r>
+        <w:t>Spark</w:t>
+      </w:r>
+      <w:proofErr w:type="spellEnd"/>
+      <w:r>
+        <w:t xml:space="preserve"> y Kafka)</w:t>
+      </w:r>
+    </w:p>
+    <w:p>
+      <w:pPr>
+        <w:pStyle w:val="Prrafodelista"/>
+        <w:numPr>
+          <w:ilvl w:val="1"/>
+          <w:numId w:val="10"/>
+        </w:numPr>
+      </w:pPr>
+      <w:r>
+        <w:t>Android (legado y base)</w:t>
+      </w:r>
+    </w:p>
+    <w:p>
+      <w:pPr>
+        <w:pStyle w:val="Prrafodelista"/>
+        <w:numPr>
+          <w:ilvl w:val="1"/>
+          <w:numId w:val="10"/>
+        </w:numPr>
+      </w:pPr>
+      <w:r>
+        <w:lastRenderedPageBreak/>
+        <w:t xml:space="preserve">Cloud </w:t>
+      </w:r>
+      <w:proofErr w:type="spellStart"/>
+      <w:r>
+        <w:t>computing</w:t>
+      </w:r>
+      <w:proofErr w:type="spellEnd"/>
+      <w:r>
+        <w:t xml:space="preserve"> (AWS/</w:t>
+      </w:r>
+      <w:proofErr w:type="spellStart"/>
+      <w:r>
+        <w:t>Azure</w:t>
+      </w:r>
+      <w:proofErr w:type="spellEnd"/>
+      <w:r>
+        <w:t>)</w:t>
+      </w:r>
+    </w:p>
+    <w:p>
+      <w:pPr>
+        <w:pStyle w:val="Prrafodelista"/>
+        <w:ind w:left="1670"/>
+      </w:pPr>
+    </w:p>
+    <w:p>
+      <w:pPr>
+        <w:pStyle w:val="Prrafodelista"/>
+        <w:numPr>
+          <w:ilvl w:val="0"/>
+          <w:numId w:val="10"/>
+        </w:numPr>
+      </w:pPr>
+      <w:r>
+        <w:t xml:space="preserve">Rust: Es un lenguaje </w:t>
+      </w:r>
+      <w:proofErr w:type="spellStart"/>
+      <w:r>
+        <w:t>multiparadigma</w:t>
+      </w:r>
+      <w:proofErr w:type="spellEnd"/>
+      <w:r>
+        <w:t xml:space="preserve"> teniendo elementos de multitud de paradigmas (imperativo, orientado a objetos, procedural, concurrente, funcional y compilado). Tiene énfasis en la seguridad, el control de distribución de memoria y la concurrencia. Normalmente C++ es más rápido, pero si se toman las consideraciones adecuadas para que un programa en C++ sea igual de seguro que uno en Rust, éste último puede ser incluso más rápido. El sistema está diseñado para tener acceso seguro a la memoria y no dejar punteros colgantes o nulos. Debido a su eficiencia y seguridad, es el primer lenguaje que le presenta competitividad real a </w:t>
+      </w:r>
+      <w:r>
+        <w:t xml:space="preserve">C (siendo el primer lenguaje en aparecer en el </w:t>
+      </w:r>
+      <w:proofErr w:type="spellStart"/>
+      <w:r>
+        <w:t>kernel</w:t>
+      </w:r>
+      <w:proofErr w:type="spellEnd"/>
+      <w:r>
+        <w:t xml:space="preserve"> de Linux, por ejemplo). Por estos motivos, sus dominios son: </w:t>
+      </w:r>
+    </w:p>
+    <w:p>
+      <w:pPr>
+        <w:pStyle w:val="Prrafodelista"/>
+        <w:numPr>
+          <w:ilvl w:val="1"/>
+          <w:numId w:val="10"/>
+        </w:numPr>
+      </w:pPr>
+      <w:r>
+        <w:t>Infraestructura de sistemas (</w:t>
+      </w:r>
+      <w:proofErr w:type="spellStart"/>
+      <w:r>
+        <w:t>kernel</w:t>
+      </w:r>
+      <w:proofErr w:type="spellEnd"/>
+      <w:r>
+        <w:t xml:space="preserve"> de Linux y partes críticas de Windows y Android).</w:t>
+      </w:r>
+    </w:p>
+    <w:p>
+      <w:pPr>
+        <w:pStyle w:val="Prrafodelista"/>
+        <w:numPr>
+          <w:ilvl w:val="1"/>
+          <w:numId w:val="10"/>
+        </w:numPr>
+      </w:pPr>
+      <w:proofErr w:type="spellStart"/>
+      <w:r>
+        <w:t>WebAssembly</w:t>
+      </w:r>
+      <w:proofErr w:type="spellEnd"/>
+      <w:r>
+        <w:t xml:space="preserve"> (compilador de </w:t>
+      </w:r>
+      <w:proofErr w:type="spellStart"/>
+      <w:r>
+        <w:t>Wasm</w:t>
+      </w:r>
+      <w:proofErr w:type="spellEnd"/>
+      <w:r>
+        <w:t>).</w:t>
+      </w:r>
+    </w:p>
+    <w:p>
+      <w:pPr>
+        <w:pStyle w:val="Prrafodelista"/>
+        <w:numPr>
+          <w:ilvl w:val="1"/>
+          <w:numId w:val="10"/>
+        </w:numPr>
+      </w:pPr>
+      <w:r>
+        <w:t>Herramientas de desarrollo.</w:t>
+      </w:r>
+    </w:p>
+    <w:p>
+      <w:pPr>
+        <w:pStyle w:val="Prrafodelista"/>
+        <w:ind w:left="1670"/>
+      </w:pPr>
+    </w:p>
+    <w:p>
+      <w:r>
+        <w:t>Ejercicio 1.7</w:t>
+      </w:r>
+      <w:r>
+        <w:t>:</w:t>
+      </w:r>
+    </w:p>
+    <w:p>
+      <w:pPr>
+        <w:ind w:left="705"/>
+      </w:pPr>
+      <w:proofErr w:type="spellStart"/>
+      <w:r>
+        <w:t>WebAssembly</w:t>
+      </w:r>
+      <w:proofErr w:type="spellEnd"/>
+      <w:r>
+        <w:t xml:space="preserve"> (</w:t>
+      </w:r>
+      <w:proofErr w:type="spellStart"/>
+      <w:r>
+        <w:t>Wasm</w:t>
+      </w:r>
+      <w:proofErr w:type="spellEnd"/>
+      <w:r>
+        <w:t>) es un forma</w:t>
+      </w:r>
+      <w:r>
+        <w:t xml:space="preserve">to de instrucciones binario para una máquina virtual basada en pila. </w:t>
+      </w:r>
+      <w:proofErr w:type="spellStart"/>
+      <w:r>
+        <w:t>Wasm</w:t>
+      </w:r>
+      <w:proofErr w:type="spellEnd"/>
+      <w:r>
+        <w:t xml:space="preserve"> está diseñado como un objetivo de compilación portátil para lenguajes de programación</w:t>
+      </w:r>
+      <w:r>
+        <w:t>, permitiendo su despliegue en la web para aplicaciones tanto de cliente como de servidor.</w:t>
+      </w:r>
+    </w:p>
+    <w:p>
+      <w:pPr>
+        <w:ind w:left="705"/>
+      </w:pPr>
+      <w:r>
+        <w:t xml:space="preserve">Ni bien casi cualquier lenguaje puede usar </w:t>
+      </w:r>
+      <w:proofErr w:type="spellStart"/>
+      <w:r>
+        <w:t>Wasm</w:t>
+      </w:r>
+      <w:proofErr w:type="spellEnd"/>
+      <w:r>
+        <w:t>, los lenguajes que mejor funcionan son los lenguajes que no tienen un recolector de basura (como C, Rust y C++). Esto permite que el binario final sea pequeño y rápido. Hay algunos lenguajes que, a pesar de tener recolectores de basura, están lo suficientemente optimizados para que no sea un problema (Go, C#/.NET)</w:t>
+      </w:r>
+    </w:p>
+    <w:p>
+      <w:pPr>
+        <w:pStyle w:val="Prrafodelista"/>
+        <w:ind w:left="1670"/>
+      </w:pPr>
+    </w:p>
+    <w:p>
+      <w:r>
+        <w:t>Ejercicio 1.8:</w:t>
+      </w:r>
+    </w:p>
+    <w:p>
+      <w:pPr>
+        <w:pStyle w:val="Prrafodelista"/>
+        <w:numPr>
+          <w:ilvl w:val="0"/>
+          <w:numId w:val="12"/>
+        </w:numPr>
+      </w:pPr>
+      <w:r>
+        <w:t>Algunos de los principales lenguajes de programación existentes al día de hoy son:</w:t>
+      </w:r>
+    </w:p>
+    <w:p>
+      <w:pPr>
+        <w:pStyle w:val="Prrafodelista"/>
+        <w:numPr>
+          <w:ilvl w:val="1"/>
+          <w:numId w:val="12"/>
+        </w:numPr>
+      </w:pPr>
+      <w:proofErr w:type="spellStart"/>
+      <w:r>
+        <w:t>ActionScript</w:t>
+      </w:r>
+      <w:proofErr w:type="spellEnd"/>
+    </w:p>
+    <w:p>
+      <w:pPr>
+        <w:pStyle w:val="Prrafodelista"/>
+        <w:numPr>
+          <w:ilvl w:val="1"/>
+          <w:numId w:val="12"/>
+        </w:numPr>
+      </w:pPr>
+      <w:r>
+        <w:t>C#</w:t>
+      </w:r>
+    </w:p>
+    <w:p>
+      <w:pPr>
+        <w:pStyle w:val="Prrafodelista"/>
+        <w:numPr>
+          <w:ilvl w:val="1"/>
+          <w:numId w:val="12"/>
+        </w:numPr>
+      </w:pPr>
+      <w:r>
+        <w:t>Visual Basic .NET</w:t>
+      </w:r>
+    </w:p>
+    <w:p>
+      <w:pPr>
+        <w:pStyle w:val="Prrafodelista"/>
+        <w:numPr>
+          <w:ilvl w:val="1"/>
+          <w:numId w:val="12"/>
+        </w:numPr>
+      </w:pPr>
+      <w:r>
+        <w:t>F#</w:t>
+      </w:r>
+    </w:p>
+    <w:p>
+      <w:pPr>
+        <w:pStyle w:val="Prrafodelista"/>
+        <w:numPr>
+          <w:ilvl w:val="1"/>
+          <w:numId w:val="12"/>
+        </w:numPr>
+      </w:pPr>
+      <w:proofErr w:type="spellStart"/>
+      <w:r>
+        <w:t>Groovy</w:t>
+      </w:r>
+      <w:proofErr w:type="spellEnd"/>
+    </w:p>
+    <w:p>
+      <w:pPr>
+        <w:pStyle w:val="Prrafodelista"/>
+        <w:numPr>
+          <w:ilvl w:val="1"/>
+          <w:numId w:val="12"/>
+        </w:numPr>
+      </w:pPr>
+      <w:proofErr w:type="spellStart"/>
+      <w:r>
+        <w:t>Scala</w:t>
+      </w:r>
+      <w:proofErr w:type="spellEnd"/>
+    </w:p>
+    <w:p>
+      <w:pPr>
+        <w:pStyle w:val="Prrafodelista"/>
+        <w:numPr>
+          <w:ilvl w:val="1"/>
+          <w:numId w:val="12"/>
+        </w:numPr>
+      </w:pPr>
+      <w:r>
+        <w:t>Factor</w:t>
+      </w:r>
+    </w:p>
+    <w:p>
+      <w:pPr>
+        <w:pStyle w:val="Prrafodelista"/>
+        <w:numPr>
+          <w:ilvl w:val="1"/>
+          <w:numId w:val="12"/>
+        </w:numPr>
+      </w:pPr>
+      <w:proofErr w:type="spellStart"/>
+      <w:r>
+        <w:t>Scratch</w:t>
+      </w:r>
+      <w:proofErr w:type="spellEnd"/>
+    </w:p>
+    <w:p>
+      <w:pPr>
+        <w:pStyle w:val="Prrafodelista"/>
+        <w:numPr>
+          <w:ilvl w:val="1"/>
+          <w:numId w:val="12"/>
+        </w:numPr>
+      </w:pPr>
+      <w:proofErr w:type="spellStart"/>
+      <w:r>
+        <w:t>Clojure</w:t>
+      </w:r>
+      <w:proofErr w:type="spellEnd"/>
+    </w:p>
+    <w:p>
+      <w:pPr>
+        <w:pStyle w:val="Prrafodelista"/>
+        <w:numPr>
+          <w:ilvl w:val="1"/>
+          <w:numId w:val="12"/>
+        </w:numPr>
+      </w:pPr>
+      <w:r>
+        <w:t>Go</w:t>
+      </w:r>
+    </w:p>
+    <w:p>
+      <w:pPr>
+        <w:pStyle w:val="Prrafodelista"/>
+        <w:numPr>
+          <w:ilvl w:val="1"/>
+          <w:numId w:val="12"/>
+        </w:numPr>
+      </w:pPr>
+      <w:proofErr w:type="spellStart"/>
+      <w:r>
+        <w:t>Dart</w:t>
+      </w:r>
+      <w:proofErr w:type="spellEnd"/>
+    </w:p>
+    <w:p>
+      <w:pPr>
+        <w:pStyle w:val="Prrafodelista"/>
+        <w:numPr>
+          <w:ilvl w:val="1"/>
+          <w:numId w:val="12"/>
+        </w:numPr>
+      </w:pPr>
+      <w:r>
+        <w:t>Swift</w:t>
+      </w:r>
+    </w:p>
+    <w:p>
+      <w:pPr>
+        <w:pStyle w:val="Prrafodelista"/>
+        <w:ind w:left="2149"/>
+      </w:pPr>
+    </w:p>
+    <w:p>
+      <w:pPr>
+        <w:pStyle w:val="Prrafodelista"/>
+        <w:numPr>
+          <w:ilvl w:val="0"/>
+          <w:numId w:val="12"/>
+        </w:numPr>
+      </w:pPr>
+      <w:r>
+        <w:lastRenderedPageBreak/>
+        <w:t>Yo creo que los lenguajes más influyentes en los lenguajes que se utilizan hoy en día pueden ser:</w:t>
+      </w:r>
+    </w:p>
+    <w:p>
+      <w:pPr>
+        <w:pStyle w:val="Prrafodelista"/>
+        <w:numPr>
+          <w:ilvl w:val="1"/>
+          <w:numId w:val="12"/>
+        </w:numPr>
+      </w:pPr>
+      <w:r>
+        <w:t>ALGOL</w:t>
+      </w:r>
+    </w:p>
+    <w:p>
+      <w:pPr>
+        <w:pStyle w:val="Prrafodelista"/>
+        <w:numPr>
+          <w:ilvl w:val="1"/>
+          <w:numId w:val="12"/>
+        </w:numPr>
+      </w:pPr>
+      <w:r>
+        <w:t>Fortran</w:t>
+      </w:r>
+    </w:p>
+    <w:p>
+      <w:pPr>
+        <w:pStyle w:val="Prrafodelista"/>
+        <w:numPr>
+          <w:ilvl w:val="1"/>
+          <w:numId w:val="12"/>
+        </w:numPr>
+      </w:pPr>
+      <w:r>
+        <w:t>COBOL</w:t>
+      </w:r>
+    </w:p>
+    <w:p>
+      <w:pPr>
+        <w:pStyle w:val="Prrafodelista"/>
+        <w:numPr>
+          <w:ilvl w:val="1"/>
+          <w:numId w:val="12"/>
+        </w:numPr>
+      </w:pPr>
+      <w:r>
+        <w:t>C/C++</w:t>
+      </w:r>
+    </w:p>
+    <w:p>
+      <w:pPr>
+        <w:pStyle w:val="Prrafodelista"/>
+        <w:numPr>
+          <w:ilvl w:val="1"/>
+          <w:numId w:val="12"/>
+        </w:numPr>
+      </w:pPr>
+      <w:r>
+        <w:t>LISP/Haskell</w:t>
+      </w:r>
+    </w:p>
+    <w:p>
+      <w:pPr>
+        <w:pStyle w:val="Prrafodelista"/>
+        <w:numPr>
+          <w:ilvl w:val="1"/>
+          <w:numId w:val="12"/>
+        </w:numPr>
+      </w:pPr>
+      <w:r>
+        <w:t>Java</w:t>
+      </w:r>
+    </w:p>
+    <w:p>
+      <w:pPr>
+        <w:pStyle w:val="Prrafodelista"/>
+        <w:numPr>
+          <w:ilvl w:val="1"/>
+          <w:numId w:val="12"/>
+        </w:numPr>
+      </w:pPr>
+      <w:r>
+        <w:t>HTML</w:t>
+      </w:r>
+    </w:p>
+    <w:p>
+      <w:pPr>
+        <w:pStyle w:val="Prrafodelista"/>
+        <w:numPr>
+          <w:ilvl w:val="1"/>
+          <w:numId w:val="12"/>
+        </w:numPr>
+      </w:pPr>
+      <w:r>
+        <w:t>SQL</w:t>
+      </w:r>
+    </w:p>
+    <w:p>
+      <w:pPr>
+        <w:pStyle w:val="Prrafodelista"/>
+        <w:ind w:left="2149"/>
+      </w:pPr>
+    </w:p>
+    <w:p>
+      <w:pPr>
+        <w:pStyle w:val="Prrafodelista"/>
+        <w:numPr>
+          <w:ilvl w:val="0"/>
+          <w:numId w:val="12"/>
+        </w:numPr>
+      </w:pPr>
+      <w:r>
+        <w:t xml:space="preserve">Personalmente, me sorprende la falta de Kotlin en estos lenguajes. Considero que es un lenguaje con una alta gama </w:t>
+      </w:r>
+      <w:r>
+        <w:t xml:space="preserve">de prestaciones, pero </w:t>
+      </w:r>
+      <w:r>
+        <w:t>sobretodo</w:t>
+      </w:r>
+      <w:r>
+        <w:t xml:space="preserve"> y más allá de las funcionalidades que puede o no tener el lenguaje, me parece que tiene un alto grado de relevancia ya que es el lenguaje elegido por Google como default para el desarrollo de sus aplicaciones en su sistema operativo Android. Dados los tiempos que corren, que demandan el uso de un </w:t>
+      </w:r>
+      <w:proofErr w:type="spellStart"/>
+      <w:r>
+        <w:t>smartphone</w:t>
+      </w:r>
+      <w:proofErr w:type="spellEnd"/>
+      <w:r>
+        <w:t xml:space="preserve"> de una u otra forma, y teniendo en cuenta la inmensa cuota de mercado que posee Android, me parece que Kotlin es un lenguaje altamente relevante e importante en el contexto del mundo actual.</w:t>
+      </w:r>
+    </w:p>
+    <w:p/>
+    <w:p>
+      <w:r>
+        <w:t>Ejercicio 1.9:</w:t>
+      </w:r>
+    </w:p>
+    <w:p>
+      <w:pPr>
+        <w:pStyle w:val="Prrafodelista"/>
+        <w:numPr>
+          <w:ilvl w:val="0"/>
+          <w:numId w:val="14"/>
+        </w:numPr>
+      </w:pPr>
+      <w:r>
+        <w:t xml:space="preserve">Fortran: Es un lenguaje que es altamente eficiente y rápido en operaciones matemáticas (incluso más que C o C++ debido a la falta de </w:t>
+      </w:r>
+      <w:proofErr w:type="spellStart"/>
+      <w:r>
+        <w:t>aliasing</w:t>
+      </w:r>
+      <w:proofErr w:type="spellEnd"/>
+      <w:r>
+        <w:t>, punteros que apuntan a la misma posición de memoria). La computación ha sido dominada por Fortran durante más de 60 años debido a que las aplicaciones científicas requieren grandes cantidades de operaciones de punto flotante.</w:t>
+      </w:r>
+    </w:p>
+    <w:p>
+      <w:pPr>
+        <w:pStyle w:val="Prrafodelista"/>
+        <w:ind w:left="1015"/>
+      </w:pPr>
+    </w:p>
+    <w:p>
+      <w:pPr>
+        <w:pStyle w:val="Prrafodelista"/>
+        <w:numPr>
+          <w:ilvl w:val="0"/>
+          <w:numId w:val="14"/>
+        </w:numPr>
+      </w:pPr>
+      <w:r>
+        <w:t xml:space="preserve">COBOL: Con COBOL pasa algo curioso. Resulta que la infraestructura armada sobre este lenguaje es inmensa y, sobre todo, de vital importancia ya que el lenguaje es el responsable de incontables programas bancarios o </w:t>
+      </w:r>
+      <w:r>
+        <w:t>relacionados a las finanzas. Migrar estos sistemas no solo sería costoso, sino también un riesgo innecesario. Por otro lado, tampoco existe una necesidad real de cambiarlo, COBOL es muy eficiente a la hora de manejar grandes volúmenes de información (</w:t>
+      </w:r>
+      <w:proofErr w:type="spellStart"/>
+      <w:r>
+        <w:t>big</w:t>
+      </w:r>
+      <w:proofErr w:type="spellEnd"/>
+      <w:r>
+        <w:t xml:space="preserve"> data), la otra particularidad que hace a COBOL un hueso duro de roer es que la aritmética que emplea no es de punto flotante (como la mayoría de lenguajes modernos), sino que es de punto fijo, permitiéndole llegar a niveles de precisión que no son fácilmente alcanzables por los otros lenguajes. Esto resulta especialmente importante en los dominios financieros en los que se utiliza.</w:t>
+      </w:r>
+    </w:p>
+    <w:p/>
+    <w:p>
+      <w:r>
+        <w:t>Ejercicio 1.10</w:t>
+      </w:r>
+      <w:r>
+        <w:t>:</w:t>
+      </w:r>
+    </w:p>
+    <w:p>
+      <w:pPr>
+        <w:pStyle w:val="Prrafodelista"/>
+        <w:numPr>
+          <w:ilvl w:val="0"/>
+          <w:numId w:val="15"/>
+        </w:numPr>
+      </w:pPr>
+      <w:r>
+        <w:t>Simula: Reconocido como el primer lenguaje en introducir los conceptos fundamentales de objetos, clases, herencia y métodos dinámicos.</w:t>
+      </w:r>
+    </w:p>
+    <w:p>
+      <w:pPr>
+        <w:pStyle w:val="Prrafodelista"/>
+        <w:numPr>
+          <w:ilvl w:val="0"/>
+          <w:numId w:val="15"/>
+        </w:numPr>
+      </w:pPr>
+      <w:r>
+        <w:lastRenderedPageBreak/>
+        <w:t>LISP: Pionero en uso de estructuras de datos en forma de listas, recursividad</w:t>
+      </w:r>
+      <w:r>
+        <w:t xml:space="preserve"> y funciones como ciudadanos de primera clase (que pueden pasarse como argumentos a otras funciones).</w:t>
+      </w:r>
+    </w:p>
+    <w:p/>
+    <w:p>
+      <w:r>
+        <w:t>Ejercicio 1.11</w:t>
+      </w:r>
+      <w:r>
+        <w:t>:</w:t>
+      </w:r>
+    </w:p>
+    <w:p>
+      <w:pPr>
+        <w:pStyle w:val="Prrafodelista"/>
+        <w:numPr>
+          <w:ilvl w:val="0"/>
+          <w:numId w:val="16"/>
+        </w:numPr>
+      </w:pPr>
+      <w:r>
+        <w:t>Falso: Hay una leve inconsistencia en un término utilizado en el enunciado. Los paradigmas declarativos. Un programa declarativo no es un conjunto de “inferencias” lógicas, eso es de lo que se encarga el intérprete por detrás. Se puede definir como un conjunto de declaraciones (reglas y hechos) más que un conjunto de inferencias</w:t>
+      </w:r>
+    </w:p>
+    <w:p>
+      <w:pPr>
+        <w:pStyle w:val="Prrafodelista"/>
+        <w:numPr>
+          <w:ilvl w:val="0"/>
+          <w:numId w:val="16"/>
+        </w:numPr>
+      </w:pPr>
+      <w:r>
+        <w:t xml:space="preserve">Falso: La descripción que da el enunciado corresponde a la de la programación </w:t>
+      </w:r>
+      <w:r>
+        <w:t>imperativa y no a la declarativa. Responde a la pregunta “cómo” mediante una serie de pasos y reglas bien definidas por el programador. Un programa declarativo debería responder a la pregunta “qué”.</w:t>
+      </w:r>
+    </w:p>
+    <w:p/>
+    <w:p>
+      <w:r>
+        <w:t>Ejercicio 1.12</w:t>
+      </w:r>
+      <w:r>
+        <w:t>:</w:t>
+      </w:r>
+    </w:p>
+    <w:p>
+      <w:pPr>
+        <w:pStyle w:val="Prrafodelista"/>
+        <w:numPr>
+          <w:ilvl w:val="0"/>
+          <w:numId w:val="17"/>
+        </w:numPr>
+      </w:pPr>
+      <w:r>
+        <w:t>V</w:t>
+      </w:r>
+    </w:p>
+    <w:p>
+      <w:pPr>
+        <w:pStyle w:val="Prrafodelista"/>
+        <w:numPr>
+          <w:ilvl w:val="0"/>
+          <w:numId w:val="17"/>
+        </w:numPr>
+      </w:pPr>
+      <w:r>
+        <w:t>V</w:t>
+      </w:r>
+    </w:p>
+    <w:p>
+      <w:pPr>
+        <w:pStyle w:val="Prrafodelista"/>
+        <w:numPr>
+          <w:ilvl w:val="0"/>
+          <w:numId w:val="17"/>
+        </w:numPr>
+      </w:pPr>
+      <w:r>
+        <w:t>V</w:t>
+      </w:r>
+    </w:p>
+    <w:p>
+      <w:pPr>
+        <w:pStyle w:val="Prrafodelista"/>
+        <w:numPr>
+          <w:ilvl w:val="0"/>
+          <w:numId w:val="17"/>
+        </w:numPr>
+      </w:pPr>
+      <w:r>
+        <w:t>F</w:t>
+      </w:r>
+    </w:p>
+    <w:p/>
+    <w:p>
+      <w:r>
+        <w:t>Ejercicio 1.13</w:t>
+      </w:r>
+      <w:r>
+        <w:t>:</w:t>
+      </w:r>
+    </w:p>
+    <w:p>
+      <w:pPr>
+        <w:pStyle w:val="Prrafodelista"/>
+        <w:numPr>
+          <w:ilvl w:val="0"/>
+          <w:numId w:val="18"/>
+        </w:numPr>
+      </w:pPr>
+      <w:r>
+        <w:t>V</w:t>
+      </w:r>
+    </w:p>
+    <w:p>
+      <w:pPr>
+        <w:pStyle w:val="Prrafodelista"/>
+        <w:numPr>
+          <w:ilvl w:val="0"/>
+          <w:numId w:val="18"/>
+        </w:numPr>
+      </w:pPr>
+      <w:r>
+        <w:t>F</w:t>
+      </w:r>
+    </w:p>
+    <w:p>
+      <w:pPr>
+        <w:pStyle w:val="Prrafodelista"/>
+        <w:numPr>
+          <w:ilvl w:val="0"/>
+          <w:numId w:val="18"/>
+        </w:numPr>
+      </w:pPr>
+      <w:r>
+        <w:t>F</w:t>
+      </w:r>
+    </w:p>
+    <w:p/>
+    <w:p>
+      <w:r>
+        <w:t>Ejercicio 1.14</w:t>
+      </w:r>
+      <w:r>
+        <w:t>:</w:t>
+      </w:r>
+    </w:p>
+    <w:p>
+      <w:pPr>
+        <w:ind w:left="705"/>
+      </w:pPr>
+      <w:r>
+        <w:t xml:space="preserve">La página de la que vamos a recopilar todos los datos tiene un sistema de benchmarks </w:t>
+      </w:r>
+      <w:r>
+        <w:t xml:space="preserve">que funciona de la siguiente manera: Se ejecuta un </w:t>
+      </w:r>
+      <w:proofErr w:type="spellStart"/>
+      <w:r>
+        <w:t>source</w:t>
+      </w:r>
+      <w:proofErr w:type="spellEnd"/>
+      <w:r>
+        <w:t xml:space="preserve"> </w:t>
+      </w:r>
+      <w:proofErr w:type="spellStart"/>
+      <w:r>
+        <w:t>code</w:t>
+      </w:r>
+      <w:proofErr w:type="spellEnd"/>
+      <w:r>
+        <w:t xml:space="preserve"> (que generalmente tiene problemas relativamente complejos o difíciles como permutaciones matemáticas o simulaciones de movimientos planetarios) y luego se comparan 2 lenguajes teniendo en cuenta los segundos que tardaron los lenguajes (</w:t>
+      </w:r>
+      <w:proofErr w:type="spellStart"/>
+      <w:r>
+        <w:t>secs</w:t>
+      </w:r>
+      <w:proofErr w:type="spellEnd"/>
+      <w:r>
+        <w:t>), cuanta memoria RAM utilizaron (KB), que tan largo o pesado resulta el código final (</w:t>
+      </w:r>
+      <w:proofErr w:type="spellStart"/>
+      <w:r>
+        <w:t>gz</w:t>
+      </w:r>
+      <w:proofErr w:type="spellEnd"/>
+      <w:r>
+        <w:t>), el tiempo total sumado de todos los núcleos del procesador (CPU)</w:t>
+      </w:r>
+      <w:r>
+        <w:t xml:space="preserve"> y, finalmente,</w:t>
+      </w:r>
+      <w:r>
+        <w:t xml:space="preserve"> el tiem</w:t>
+      </w:r>
+      <w:r>
+        <w:t>po que se demoró en compilar</w:t>
+      </w:r>
+      <w:r>
+        <w:t xml:space="preserve"> el programa</w:t>
+      </w:r>
+      <w:r>
+        <w:t xml:space="preserve"> (</w:t>
+      </w:r>
+      <w:proofErr w:type="spellStart"/>
+      <w:r>
+        <w:t>make</w:t>
+      </w:r>
+      <w:proofErr w:type="spellEnd"/>
+      <w:r>
+        <w:t>)</w:t>
+      </w:r>
+      <w:r>
+        <w:t>.</w:t>
+      </w:r>
+      <w:r>
+        <w:t xml:space="preserve"> </w:t>
+      </w:r>
+    </w:p>
+    <w:p>
+      <w:pPr>
+        <w:ind w:left="705"/>
+      </w:pPr>
+      <w:r>
+        <w:t>Para éste ejercicio vamos a comparar los lenguajes Java y Go, veremos sus diferencias en rendimiento y en velocidad.</w:t>
+      </w:r>
+    </w:p>
+    <w:p>
+      <w:pPr>
+        <w:pStyle w:val="Prrafodelista"/>
+        <w:ind w:left="1425"/>
+      </w:pPr>
+    </w:p>
+    <w:p>
+      <w:pPr>
+        <w:pStyle w:val="Prrafodelista"/>
+        <w:numPr>
+          <w:ilvl w:val="0"/>
+          <w:numId w:val="21"/>
+        </w:numPr>
+      </w:pPr>
+    </w:p>
+    <w:p>
+      <w:pPr>
+        <w:pStyle w:val="Prrafodelista"/>
+        <w:numPr>
+          <w:ilvl w:val="0"/>
+          <w:numId w:val="21"/>
+        </w:numPr>
+      </w:pPr>
+      <w:r>
+        <w:t>Test</w:t>
+      </w:r>
+      <w:r>
+        <w:t xml:space="preserve">: </w:t>
+      </w:r>
+    </w:p>
+    <w:p>
+      <w:pPr>
+        <w:pStyle w:val="Prrafodelista"/>
+      </w:pPr>
+    </w:p>
+    <w:p>
+      <w:pPr>
+        <w:pStyle w:val="Prrafodelista"/>
+        <w:numPr>
+          <w:ilvl w:val="1"/>
+          <w:numId w:val="21"/>
+        </w:numPr>
+      </w:pPr>
+      <w:proofErr w:type="spellStart"/>
+      <w:r>
+        <w:lastRenderedPageBreak/>
+        <w:t>Secs</w:t>
+      </w:r>
+      <w:proofErr w:type="spellEnd"/>
+      <w:r>
+        <w:t>: Java se demoró 46.66s en completar la prueba, mientras que Go 46.</w:t>
+      </w:r>
+      <w:r>
+        <w:t>15</w:t>
+      </w:r>
+      <w:r>
+        <w:t xml:space="preserve">s. No se puede </w:t>
+      </w:r>
+      <w:r>
+        <w:t>notar una diferencia sustancial entre los 2 lenguajes, por lo que, depende la aplicación, el tiempo de ejecución no debe ser un factor determinante para la elección de uno sobre otro.</w:t>
+      </w:r>
+    </w:p>
+    <w:p>
+      <w:pPr>
+        <w:pStyle w:val="Prrafodelista"/>
+        <w:numPr>
+          <w:ilvl w:val="1"/>
+          <w:numId w:val="21"/>
+        </w:numPr>
+      </w:pPr>
+      <w:r>
+        <w:t>KB: Aquí es dónde se puede notar una diferencia sustancial entre uno y otro. Mientras que Go usó solamente 4903 KB de memoria, Java usó la asombrosa cantidad de 59994 KB. Esta diferencia es muchísimo más notoria que la del tiempo de ejecución. El motivo del uso tan extenso de la memoria de Java es, principalmente la máquina virtual sobre la que corre. Java se ve obligado a cargar toda su máquina virtual cada vez que quiere correr un programa, por más pequeño que sea. Si la memoria es un factor limitante, Java no es la mejor opción.</w:t>
+      </w:r>
+    </w:p>
+    <w:p>
+      <w:pPr>
+        <w:pStyle w:val="Prrafodelista"/>
+        <w:numPr>
+          <w:ilvl w:val="1"/>
+          <w:numId w:val="21"/>
+        </w:numPr>
+      </w:pPr>
+      <w:proofErr w:type="spellStart"/>
+      <w:r>
+        <w:t>gz</w:t>
+      </w:r>
+      <w:proofErr w:type="spellEnd"/>
+      <w:r>
+        <w:t xml:space="preserve">: En este campo volvemos a ver una puntuación igualada. En este apartado Java tiene un puntaje de 517 bytes y Go 500 bytes. De esto se puede deducir que no hay un lenguaje que sea más eficiente a la hora de </w:t>
+      </w:r>
+      <w:r>
+        <w:t>escribir o más “liviano” una vez completado el código fuente.</w:t>
+      </w:r>
+    </w:p>
+    <w:p>
+      <w:pPr>
+        <w:pStyle w:val="Prrafodelista"/>
+        <w:numPr>
+          <w:ilvl w:val="1"/>
+          <w:numId w:val="21"/>
+        </w:numPr>
+      </w:pPr>
+      <w:r>
+        <w:t>CPU: Aquí podemos apreciar que Java toma unos segundos más que Go cuando tomamos en cuenta el tiempo que toman todos los núcleos al mismo tiempo. También vale resaltar que Go es más constate con el intervalo de tiempos, es más consistente: a Java le tomó de 49.88s a 55.68s mientras que a Go de 46.26s a 46.33</w:t>
+      </w:r>
+    </w:p>
+    <w:p>
+      <w:pPr>
+        <w:pStyle w:val="Prrafodelista"/>
+        <w:numPr>
+          <w:ilvl w:val="1"/>
+          <w:numId w:val="21"/>
+        </w:numPr>
+      </w:pPr>
+      <w:proofErr w:type="spellStart"/>
+      <w:r>
+        <w:t>Make</w:t>
+      </w:r>
+      <w:proofErr w:type="spellEnd"/>
+      <w:r>
+        <w:t>: Finalmente, podemos concluir que Java compiló el programa en 1.65s mientras que a Go le tomó 5.43s, esto es una victoria contundente para Java ¿Por qué sucede esto? Java s</w:t>
+      </w:r>
+      <w:r>
+        <w:t xml:space="preserve">e “saltea” el proceso de compilación, mucho del trabajo duro lo hace en tiempo de ejecución (el compilador </w:t>
+      </w:r>
+      <w:proofErr w:type="spellStart"/>
+      <w:r>
+        <w:t>Just</w:t>
+      </w:r>
+      <w:proofErr w:type="spellEnd"/>
+      <w:r>
+        <w:t xml:space="preserve"> In Time o JIT dentro de la JVM analiza el código mientras está corriendo).</w:t>
+      </w:r>
+    </w:p>
+    <w:p>
+      <w:pPr>
+        <w:pStyle w:val="Prrafodelista"/>
+        <w:ind w:left="2149"/>
+      </w:pPr>
+    </w:p>
+    <w:p>
+      <w:pPr>
+        <w:pStyle w:val="Prrafodelista"/>
+        <w:numPr>
+          <w:ilvl w:val="0"/>
+          <w:numId w:val="21"/>
+        </w:numPr>
+      </w:pPr>
+      <w:r>
+        <w:t xml:space="preserve">Bueno, los motivos por los cuales un lenguaje puede ser más o menos rápido o eficiente son extensos. Puede tener que ver con la estructura o el paradigma de un lenguaje o con las funciones que este disponga o de la naturaleza del sistema que se desea resolver. Por ejemplo, problemas de naturaleza recursiva pueden ser resueltos con eficiencia por programas como </w:t>
+      </w:r>
+      <w:proofErr w:type="spellStart"/>
+      <w:r>
+        <w:t>Prolog</w:t>
+      </w:r>
+      <w:proofErr w:type="spellEnd"/>
+      <w:r>
+        <w:t xml:space="preserve">, por su funcionamiento con </w:t>
+      </w:r>
+      <w:proofErr w:type="spellStart"/>
+      <w:r>
+        <w:t>backtracking</w:t>
+      </w:r>
+      <w:proofErr w:type="spellEnd"/>
+      <w:r>
+        <w:t xml:space="preserve"> mientras que, éste mismo puede sufrir muchísimo con tareas como realizar el backend de un sitio web. También hay que tener en cuenta que definimos como velocidad, quizás un cliente está más interesado en tener un software funcional en un corto periodo de tiempo y no tanto en que el software sea el más eficiente. </w:t>
+      </w:r>
+      <w:r>
+        <w:t>En conclusión, el rendimiento de un lenguaje depende de un compromiso (</w:t>
+      </w:r>
+      <w:proofErr w:type="spellStart"/>
+      <w:r>
+        <w:t>trade</w:t>
+      </w:r>
+      <w:proofErr w:type="spellEnd"/>
+      <w:r>
+        <w:t>-off) entre la abstracción y el control sobre el hardware. Lenguajes de bajo nivel que exigen mayor complejidad al programador suelen lograr menores tiempos de ejecución, mientras que lenguajes con implementaciones híbridas (como Java) o dinámicas sacrifican rendimiento bruto a cambio de portabilidad o velocidad de desarrollo.</w:t>
+      </w:r>
+    </w:p>
+    <w:p>
+      <w:pPr>
+        <w:pStyle w:val="Prrafodelista"/>
+        <w:ind w:left="1429"/>
+      </w:pPr>
+    </w:p>
+    <w:p>
+      <w:pPr>
+        <w:pStyle w:val="Prrafodelista"/>
+        <w:numPr>
+          <w:ilvl w:val="0"/>
+          <w:numId w:val="21"/>
+        </w:numPr>
+      </w:pPr>
+    </w:p>
+    <w:p>
+      <w:pPr>
+        <w:pStyle w:val="Prrafodelista"/>
+      </w:pPr>
+    </w:p>
+    <w:p>
+      <w:pPr>
+        <w:pStyle w:val="Prrafodelista"/>
+        <w:numPr>
+          <w:ilvl w:val="1"/>
+          <w:numId w:val="21"/>
+        </w:numPr>
+      </w:pPr>
+      <w:r>
+        <w:lastRenderedPageBreak/>
+        <w:t xml:space="preserve">En este test específico, las similitudes no están en los lenguajes en sí, sino en </w:t>
+      </w:r>
+      <w:r>
+        <w:t>cómo se escribió el código</w:t>
+      </w:r>
+      <w:r>
+        <w:t xml:space="preserve"> para que la compa</w:t>
+      </w:r>
+      <w:r>
+        <w:t xml:space="preserve">ración sea lo más justa posible. </w:t>
+      </w:r>
+      <w:r>
+        <w:t xml:space="preserve">Todos los programas comparten exactamente la misma lógica imperativa paso a paso. Es decir, si el programa original en C usó un bucle </w:t>
+      </w:r>
+      <w:proofErr w:type="spellStart"/>
+      <w:r>
+        <w:t>for</w:t>
+      </w:r>
+      <w:proofErr w:type="spellEnd"/>
+      <w:r>
+        <w:t xml:space="preserve"> clásico y arreglos primitivos, el programa en Python o en Java se escribió usando exactamente el mismo bucle y la misma estructura, sin usar "atajos" propios de cada lenguaje.</w:t>
+      </w:r>
+      <w:r>
+        <w:t xml:space="preserve"> </w:t>
+      </w:r>
+      <w:r>
+        <w:t xml:space="preserve">En los tests de rendimiento 'more similar' (comparables), la principal </w:t>
+      </w:r>
+      <w:r>
+        <w:t>similitud</w:t>
+      </w:r>
+      <w:r>
+        <w:t xml:space="preserve"> radica en la estructura del código fuente: todos los lenguajes son forzados a implementar el algoritmo mediante una traducción literal, utilizando un solo hilo de ejecución (single-</w:t>
+      </w:r>
+      <w:proofErr w:type="spellStart"/>
+      <w:r>
+        <w:t>thread</w:t>
+      </w:r>
+      <w:proofErr w:type="spellEnd"/>
+      <w:r>
+        <w:t xml:space="preserve">) y sin optimizaciones </w:t>
+      </w:r>
+      <w:bookmarkStart w:id="0" w:name="_GoBack"/>
+      <w:bookmarkEnd w:id="0"/>
+      <w:r>
+        <w:t xml:space="preserve">idiomáticas. Sin embargo, las </w:t>
+      </w:r>
+      <w:r>
+        <w:t>diferencias</w:t>
+      </w:r>
+      <w:r>
+        <w:t xml:space="preserve"> se manifiestan en el rendimiento resultante debido a la arquitectura interna de cada lenguaje.</w:t>
+      </w:r>
+    </w:p>
+    <w:p>
+      <w:pPr>
+        <w:pStyle w:val="Prrafodelista"/>
+        <w:ind w:left="2149"/>
+      </w:pPr>
+    </w:p>
+    <w:p>
+      <w:pPr>
+        <w:pStyle w:val="Prrafodelista"/>
+        <w:numPr>
+          <w:ilvl w:val="1"/>
+          <w:numId w:val="21"/>
+        </w:numPr>
+      </w:pPr>
+      <w:r>
+        <w:t>Los benchmarks de eficiencia energética evalúan el impacto eléctrico (medido en Joules) que requiere un lenguaje de programación para ejecutar un algoritmo. Estos tests demuestran que el consumo de energía no depende únicamente del tiempo de ejecución (CPU), sino también de la gestión de la memoria RAM. Lenguajes compilados a código nativo (como C o Rust) resultan ser los más 'ecológicos' al minimizar la sobrecarga del sistema, mientras que los lenguajes interpretados (como Python) o los basados en máquinas virtuales pesadas (como Java) presentan un consumo energético significativamente mayor. En la industria actual (Cloud Computing y dispositivos móviles), elegir un lenguaje energéticamente eficiente es crítico para reducir costos operativos, maximizar la vida útil de las baterías y disminuir la huella de carbono del software.</w:t>
+      </w:r>
+    </w:p>
+    <w:p>
+      <w:pPr>
+        <w:pStyle w:val="Prrafodelista"/>
+      </w:pPr>
+    </w:p>
+    <w:p>
+      <w:pPr>
+        <w:pStyle w:val="Prrafodelista"/>
+        <w:numPr>
+          <w:ilvl w:val="1"/>
+          <w:numId w:val="21"/>
+        </w:numPr>
+      </w:pPr>
+      <w:r>
+        <w:t xml:space="preserve">Según investigaciones independientes sobre eficiencia energética (Green Computing), la suposición de que un programa más rápido es siempre energéticamente más eficiente no siempre se cumple. Aunque existe una fuerte correlación, los investigadores concluyen que la gestión de la memoria (DRAM) juega un rol crucial en el consumo de Watts. Lenguajes híbridos o con máquina virtual (como Java) pueden tener tiempos de ejecución competitivos, pero su alto uso de memoria eleva su consumo energético total. Por lo tanto, los lenguajes compilados a nativo (como C, Rust o Go) se posicionan como las herramientas más eficientes y ecológicas, demostrando </w:t>
+      </w:r>
+      <w:r>
+        <w:t>que,</w:t>
+      </w:r>
+      <w:r>
+        <w:t xml:space="preserve"> en el desarrollo de software a gran escala, la velocidad y la eficiencia de recursos no siempre van de la mano.</w:t>
       </w:r>
     </w:p>
     <w:sectPr>
@@ -1334,6 +3022,743 @@
 <file path=word/numbering.xml><?xml version="1.0" encoding="utf-8"?>
 <w:numbering xmlns:wpc="http://schemas.microsoft.com/office/word/2010/wordprocessingCanvas" xmlns:cx="http://schemas.microsoft.com/office/drawing/2014/chartex" xmlns:cx1="http://schemas.microsoft.com/office/drawing/2015/9/8/chartex" xmlns:mc="http://schemas.openxmlformats.org/markup-compatibility/2006" xmlns:o="urn:schemas-microsoft-com:office:office" xmlns:r="http://schemas.openxmlformats.org/officeDocument/2006/relationships" xmlns:m="http://schemas.openxmlformats.org/officeDocument/2006/math" xmlns:v="urn:schemas-microsoft-com:vml" xmlns:wp14="http://schemas.microsoft.com/office/word/2010/wordprocessingDrawing" xmlns:wp="http://schemas.openxmlformats.org/drawingml/2006/wordprocessingDrawing" xmlns:w10="urn:schemas-microsoft-com:office:word" xmlns:w="http://schemas.openxmlformats.org/wordprocessingml/2006/main" xmlns:w14="http://schemas.microsoft.com/office/word/2010/wordml" xmlns:w15="http://schemas.microsoft.com/office/word/2012/wordml" xmlns:w16se="http://schemas.microsoft.com/office/word/2015/wordml/symex" xmlns:wpg="http://schemas.microsoft.com/office/word/2010/wordprocessingGroup" xmlns:wpi="http://schemas.microsoft.com/office/word/2010/wordprocessingInk" xmlns:wne="http://schemas.microsoft.com/office/word/2006/wordml" xmlns:wps="http://schemas.microsoft.com/office/word/2010/wordprocessingShape" mc:Ignorable="w14 w15 w16se wp14">
   <w:abstractNum w:abstractNumId="0" w15:restartNumberingAfterBreak="0">
+    <w:nsid w:val="069D653C"/>
+    <w:multiLevelType w:val="hybridMultilevel"/>
+    <w:tmpl w:val="EECCCFF2"/>
+    <w:lvl w:ilvl="0" w:tplc="580A0003">
+      <w:start w:val="1"/>
+      <w:numFmt w:val="bullet"/>
+      <w:lvlText w:val="o"/>
+      <w:lvlJc w:val="left"/>
+      <w:pPr>
+        <w:ind w:left="360" w:hanging="360"/>
+      </w:pPr>
+      <w:rPr>
+        <w:rFonts w:ascii="Courier New" w:hAnsi="Courier New" w:cs="Courier New" w:hint="default"/>
+      </w:rPr>
+    </w:lvl>
+    <w:lvl w:ilvl="1" w:tplc="580A0003" w:tentative="1">
+      <w:start w:val="1"/>
+      <w:numFmt w:val="bullet"/>
+      <w:lvlText w:val="o"/>
+      <w:lvlJc w:val="left"/>
+      <w:pPr>
+        <w:ind w:left="360" w:hanging="360"/>
+      </w:pPr>
+      <w:rPr>
+        <w:rFonts w:ascii="Courier New" w:hAnsi="Courier New" w:cs="Courier New" w:hint="default"/>
+      </w:rPr>
+    </w:lvl>
+    <w:lvl w:ilvl="2" w:tplc="580A0005" w:tentative="1">
+      <w:start w:val="1"/>
+      <w:numFmt w:val="bullet"/>
+      <w:lvlText w:val=""/>
+      <w:lvlJc w:val="left"/>
+      <w:pPr>
+        <w:ind w:left="1080" w:hanging="360"/>
+      </w:pPr>
+      <w:rPr>
+        <w:rFonts w:ascii="Wingdings" w:hAnsi="Wingdings" w:hint="default"/>
+      </w:rPr>
+    </w:lvl>
+    <w:lvl w:ilvl="3" w:tplc="580A0001" w:tentative="1">
+      <w:start w:val="1"/>
+      <w:numFmt w:val="bullet"/>
+      <w:lvlText w:val=""/>
+      <w:lvlJc w:val="left"/>
+      <w:pPr>
+        <w:ind w:left="1800" w:hanging="360"/>
+      </w:pPr>
+      <w:rPr>
+        <w:rFonts w:ascii="Symbol" w:hAnsi="Symbol" w:hint="default"/>
+      </w:rPr>
+    </w:lvl>
+    <w:lvl w:ilvl="4" w:tplc="580A0003" w:tentative="1">
+      <w:start w:val="1"/>
+      <w:numFmt w:val="bullet"/>
+      <w:lvlText w:val="o"/>
+      <w:lvlJc w:val="left"/>
+      <w:pPr>
+        <w:ind w:left="2520" w:hanging="360"/>
+      </w:pPr>
+      <w:rPr>
+        <w:rFonts w:ascii="Courier New" w:hAnsi="Courier New" w:cs="Courier New" w:hint="default"/>
+      </w:rPr>
+    </w:lvl>
+    <w:lvl w:ilvl="5" w:tplc="580A0005" w:tentative="1">
+      <w:start w:val="1"/>
+      <w:numFmt w:val="bullet"/>
+      <w:lvlText w:val=""/>
+      <w:lvlJc w:val="left"/>
+      <w:pPr>
+        <w:ind w:left="3240" w:hanging="360"/>
+      </w:pPr>
+      <w:rPr>
+        <w:rFonts w:ascii="Wingdings" w:hAnsi="Wingdings" w:hint="default"/>
+      </w:rPr>
+    </w:lvl>
+    <w:lvl w:ilvl="6" w:tplc="580A0001" w:tentative="1">
+      <w:start w:val="1"/>
+      <w:numFmt w:val="bullet"/>
+      <w:lvlText w:val=""/>
+      <w:lvlJc w:val="left"/>
+      <w:pPr>
+        <w:ind w:left="3960" w:hanging="360"/>
+      </w:pPr>
+      <w:rPr>
+        <w:rFonts w:ascii="Symbol" w:hAnsi="Symbol" w:hint="default"/>
+      </w:rPr>
+    </w:lvl>
+    <w:lvl w:ilvl="7" w:tplc="580A0003" w:tentative="1">
+      <w:start w:val="1"/>
+      <w:numFmt w:val="bullet"/>
+      <w:lvlText w:val="o"/>
+      <w:lvlJc w:val="left"/>
+      <w:pPr>
+        <w:ind w:left="4680" w:hanging="360"/>
+      </w:pPr>
+      <w:rPr>
+        <w:rFonts w:ascii="Courier New" w:hAnsi="Courier New" w:cs="Courier New" w:hint="default"/>
+      </w:rPr>
+    </w:lvl>
+    <w:lvl w:ilvl="8" w:tplc="580A0005" w:tentative="1">
+      <w:start w:val="1"/>
+      <w:numFmt w:val="bullet"/>
+      <w:lvlText w:val=""/>
+      <w:lvlJc w:val="left"/>
+      <w:pPr>
+        <w:ind w:left="5400" w:hanging="360"/>
+      </w:pPr>
+      <w:rPr>
+        <w:rFonts w:ascii="Wingdings" w:hAnsi="Wingdings" w:hint="default"/>
+      </w:rPr>
+    </w:lvl>
+  </w:abstractNum>
+  <w:abstractNum w:abstractNumId="1" w15:restartNumberingAfterBreak="0">
+    <w:nsid w:val="0C8F0A59"/>
+    <w:multiLevelType w:val="multilevel"/>
+    <w:tmpl w:val="985EDF44"/>
+    <w:lvl w:ilvl="0">
+      <w:start w:val="1"/>
+      <w:numFmt w:val="upperLetter"/>
+      <w:lvlText w:val="%1."/>
+      <w:lvlJc w:val="left"/>
+      <w:pPr>
+        <w:ind w:left="1429" w:hanging="360"/>
+      </w:pPr>
+      <w:rPr>
+        <w:rFonts w:hint="default"/>
+      </w:rPr>
+    </w:lvl>
+    <w:lvl w:ilvl="1">
+      <w:start w:val="1"/>
+      <w:numFmt w:val="bullet"/>
+      <w:lvlText w:val=""/>
+      <w:lvlJc w:val="left"/>
+      <w:pPr>
+        <w:ind w:left="2149" w:hanging="360"/>
+      </w:pPr>
+      <w:rPr>
+        <w:rFonts w:ascii="Symbol" w:hAnsi="Symbol" w:hint="default"/>
+      </w:rPr>
+    </w:lvl>
+    <w:lvl w:ilvl="2">
+      <w:start w:val="1"/>
+      <w:numFmt w:val="lowerRoman"/>
+      <w:lvlText w:val="%3."/>
+      <w:lvlJc w:val="right"/>
+      <w:pPr>
+        <w:ind w:left="2869" w:hanging="180"/>
+      </w:pPr>
+      <w:rPr>
+        <w:rFonts w:hint="default"/>
+      </w:rPr>
+    </w:lvl>
+    <w:lvl w:ilvl="3">
+      <w:start w:val="1"/>
+      <w:numFmt w:val="decimal"/>
+      <w:lvlText w:val="%4."/>
+      <w:lvlJc w:val="left"/>
+      <w:pPr>
+        <w:ind w:left="3589" w:hanging="360"/>
+      </w:pPr>
+      <w:rPr>
+        <w:rFonts w:hint="default"/>
+      </w:rPr>
+    </w:lvl>
+    <w:lvl w:ilvl="4">
+      <w:start w:val="1"/>
+      <w:numFmt w:val="lowerLetter"/>
+      <w:lvlText w:val="%5."/>
+      <w:lvlJc w:val="left"/>
+      <w:pPr>
+        <w:ind w:left="4309" w:hanging="360"/>
+      </w:pPr>
+      <w:rPr>
+        <w:rFonts w:hint="default"/>
+      </w:rPr>
+    </w:lvl>
+    <w:lvl w:ilvl="5">
+      <w:start w:val="1"/>
+      <w:numFmt w:val="lowerRoman"/>
+      <w:lvlText w:val="%6."/>
+      <w:lvlJc w:val="right"/>
+      <w:pPr>
+        <w:ind w:left="5029" w:hanging="180"/>
+      </w:pPr>
+      <w:rPr>
+        <w:rFonts w:hint="default"/>
+      </w:rPr>
+    </w:lvl>
+    <w:lvl w:ilvl="6">
+      <w:start w:val="1"/>
+      <w:numFmt w:val="decimal"/>
+      <w:lvlText w:val="%7."/>
+      <w:lvlJc w:val="left"/>
+      <w:pPr>
+        <w:ind w:left="5749" w:hanging="360"/>
+      </w:pPr>
+      <w:rPr>
+        <w:rFonts w:hint="default"/>
+      </w:rPr>
+    </w:lvl>
+    <w:lvl w:ilvl="7">
+      <w:start w:val="1"/>
+      <w:numFmt w:val="lowerLetter"/>
+      <w:lvlText w:val="%8."/>
+      <w:lvlJc w:val="left"/>
+      <w:pPr>
+        <w:ind w:left="6469" w:hanging="360"/>
+      </w:pPr>
+      <w:rPr>
+        <w:rFonts w:hint="default"/>
+      </w:rPr>
+    </w:lvl>
+    <w:lvl w:ilvl="8">
+      <w:start w:val="1"/>
+      <w:numFmt w:val="lowerRoman"/>
+      <w:lvlText w:val="%9."/>
+      <w:lvlJc w:val="right"/>
+      <w:pPr>
+        <w:ind w:left="7189" w:hanging="180"/>
+      </w:pPr>
+      <w:rPr>
+        <w:rFonts w:hint="default"/>
+      </w:rPr>
+    </w:lvl>
+  </w:abstractNum>
+  <w:abstractNum w:abstractNumId="2" w15:restartNumberingAfterBreak="0">
+    <w:nsid w:val="114F35DA"/>
+    <w:multiLevelType w:val="hybridMultilevel"/>
+    <w:tmpl w:val="E7125D0E"/>
+    <w:lvl w:ilvl="0" w:tplc="580A0001">
+      <w:start w:val="1"/>
+      <w:numFmt w:val="bullet"/>
+      <w:lvlText w:val=""/>
+      <w:lvlJc w:val="left"/>
+      <w:pPr>
+        <w:ind w:left="1015" w:hanging="360"/>
+      </w:pPr>
+      <w:rPr>
+        <w:rFonts w:ascii="Symbol" w:hAnsi="Symbol" w:hint="default"/>
+      </w:rPr>
+    </w:lvl>
+    <w:lvl w:ilvl="1" w:tplc="580A0003">
+      <w:start w:val="1"/>
+      <w:numFmt w:val="bullet"/>
+      <w:lvlText w:val="o"/>
+      <w:lvlJc w:val="left"/>
+      <w:pPr>
+        <w:ind w:left="1670" w:hanging="360"/>
+      </w:pPr>
+      <w:rPr>
+        <w:rFonts w:ascii="Courier New" w:hAnsi="Courier New" w:cs="Courier New" w:hint="default"/>
+      </w:rPr>
+    </w:lvl>
+    <w:lvl w:ilvl="2" w:tplc="580A0005" w:tentative="1">
+      <w:start w:val="1"/>
+      <w:numFmt w:val="bullet"/>
+      <w:lvlText w:val=""/>
+      <w:lvlJc w:val="left"/>
+      <w:pPr>
+        <w:ind w:left="2390" w:hanging="360"/>
+      </w:pPr>
+      <w:rPr>
+        <w:rFonts w:ascii="Wingdings" w:hAnsi="Wingdings" w:hint="default"/>
+      </w:rPr>
+    </w:lvl>
+    <w:lvl w:ilvl="3" w:tplc="580A0001" w:tentative="1">
+      <w:start w:val="1"/>
+      <w:numFmt w:val="bullet"/>
+      <w:lvlText w:val=""/>
+      <w:lvlJc w:val="left"/>
+      <w:pPr>
+        <w:ind w:left="3110" w:hanging="360"/>
+      </w:pPr>
+      <w:rPr>
+        <w:rFonts w:ascii="Symbol" w:hAnsi="Symbol" w:hint="default"/>
+      </w:rPr>
+    </w:lvl>
+    <w:lvl w:ilvl="4" w:tplc="580A0003" w:tentative="1">
+      <w:start w:val="1"/>
+      <w:numFmt w:val="bullet"/>
+      <w:lvlText w:val="o"/>
+      <w:lvlJc w:val="left"/>
+      <w:pPr>
+        <w:ind w:left="3830" w:hanging="360"/>
+      </w:pPr>
+      <w:rPr>
+        <w:rFonts w:ascii="Courier New" w:hAnsi="Courier New" w:cs="Courier New" w:hint="default"/>
+      </w:rPr>
+    </w:lvl>
+    <w:lvl w:ilvl="5" w:tplc="580A0005" w:tentative="1">
+      <w:start w:val="1"/>
+      <w:numFmt w:val="bullet"/>
+      <w:lvlText w:val=""/>
+      <w:lvlJc w:val="left"/>
+      <w:pPr>
+        <w:ind w:left="4550" w:hanging="360"/>
+      </w:pPr>
+      <w:rPr>
+        <w:rFonts w:ascii="Wingdings" w:hAnsi="Wingdings" w:hint="default"/>
+      </w:rPr>
+    </w:lvl>
+    <w:lvl w:ilvl="6" w:tplc="580A0001" w:tentative="1">
+      <w:start w:val="1"/>
+      <w:numFmt w:val="bullet"/>
+      <w:lvlText w:val=""/>
+      <w:lvlJc w:val="left"/>
+      <w:pPr>
+        <w:ind w:left="5270" w:hanging="360"/>
+      </w:pPr>
+      <w:rPr>
+        <w:rFonts w:ascii="Symbol" w:hAnsi="Symbol" w:hint="default"/>
+      </w:rPr>
+    </w:lvl>
+    <w:lvl w:ilvl="7" w:tplc="580A0003" w:tentative="1">
+      <w:start w:val="1"/>
+      <w:numFmt w:val="bullet"/>
+      <w:lvlText w:val="o"/>
+      <w:lvlJc w:val="left"/>
+      <w:pPr>
+        <w:ind w:left="5990" w:hanging="360"/>
+      </w:pPr>
+      <w:rPr>
+        <w:rFonts w:ascii="Courier New" w:hAnsi="Courier New" w:cs="Courier New" w:hint="default"/>
+      </w:rPr>
+    </w:lvl>
+    <w:lvl w:ilvl="8" w:tplc="580A0005" w:tentative="1">
+      <w:start w:val="1"/>
+      <w:numFmt w:val="bullet"/>
+      <w:lvlText w:val=""/>
+      <w:lvlJc w:val="left"/>
+      <w:pPr>
+        <w:ind w:left="6710" w:hanging="360"/>
+      </w:pPr>
+      <w:rPr>
+        <w:rFonts w:ascii="Wingdings" w:hAnsi="Wingdings" w:hint="default"/>
+      </w:rPr>
+    </w:lvl>
+  </w:abstractNum>
+  <w:abstractNum w:abstractNumId="3" w15:restartNumberingAfterBreak="0">
+    <w:nsid w:val="175F511C"/>
+    <w:multiLevelType w:val="multilevel"/>
+    <w:tmpl w:val="985EDF44"/>
+    <w:lvl w:ilvl="0">
+      <w:start w:val="1"/>
+      <w:numFmt w:val="upperLetter"/>
+      <w:lvlText w:val="%1."/>
+      <w:lvlJc w:val="left"/>
+      <w:pPr>
+        <w:ind w:left="1429" w:hanging="360"/>
+      </w:pPr>
+      <w:rPr>
+        <w:rFonts w:hint="default"/>
+      </w:rPr>
+    </w:lvl>
+    <w:lvl w:ilvl="1">
+      <w:start w:val="1"/>
+      <w:numFmt w:val="bullet"/>
+      <w:lvlText w:val=""/>
+      <w:lvlJc w:val="left"/>
+      <w:pPr>
+        <w:ind w:left="2149" w:hanging="360"/>
+      </w:pPr>
+      <w:rPr>
+        <w:rFonts w:ascii="Symbol" w:hAnsi="Symbol" w:hint="default"/>
+      </w:rPr>
+    </w:lvl>
+    <w:lvl w:ilvl="2">
+      <w:start w:val="1"/>
+      <w:numFmt w:val="lowerRoman"/>
+      <w:lvlText w:val="%3."/>
+      <w:lvlJc w:val="right"/>
+      <w:pPr>
+        <w:ind w:left="2869" w:hanging="180"/>
+      </w:pPr>
+      <w:rPr>
+        <w:rFonts w:hint="default"/>
+      </w:rPr>
+    </w:lvl>
+    <w:lvl w:ilvl="3">
+      <w:start w:val="1"/>
+      <w:numFmt w:val="decimal"/>
+      <w:lvlText w:val="%4."/>
+      <w:lvlJc w:val="left"/>
+      <w:pPr>
+        <w:ind w:left="3589" w:hanging="360"/>
+      </w:pPr>
+      <w:rPr>
+        <w:rFonts w:hint="default"/>
+      </w:rPr>
+    </w:lvl>
+    <w:lvl w:ilvl="4">
+      <w:start w:val="1"/>
+      <w:numFmt w:val="lowerLetter"/>
+      <w:lvlText w:val="%5."/>
+      <w:lvlJc w:val="left"/>
+      <w:pPr>
+        <w:ind w:left="4309" w:hanging="360"/>
+      </w:pPr>
+      <w:rPr>
+        <w:rFonts w:hint="default"/>
+      </w:rPr>
+    </w:lvl>
+    <w:lvl w:ilvl="5">
+      <w:start w:val="1"/>
+      <w:numFmt w:val="lowerRoman"/>
+      <w:lvlText w:val="%6."/>
+      <w:lvlJc w:val="right"/>
+      <w:pPr>
+        <w:ind w:left="5029" w:hanging="180"/>
+      </w:pPr>
+      <w:rPr>
+        <w:rFonts w:hint="default"/>
+      </w:rPr>
+    </w:lvl>
+    <w:lvl w:ilvl="6">
+      <w:start w:val="1"/>
+      <w:numFmt w:val="decimal"/>
+      <w:lvlText w:val="%7."/>
+      <w:lvlJc w:val="left"/>
+      <w:pPr>
+        <w:ind w:left="5749" w:hanging="360"/>
+      </w:pPr>
+      <w:rPr>
+        <w:rFonts w:hint="default"/>
+      </w:rPr>
+    </w:lvl>
+    <w:lvl w:ilvl="7">
+      <w:start w:val="1"/>
+      <w:numFmt w:val="lowerLetter"/>
+      <w:lvlText w:val="%8."/>
+      <w:lvlJc w:val="left"/>
+      <w:pPr>
+        <w:ind w:left="6469" w:hanging="360"/>
+      </w:pPr>
+      <w:rPr>
+        <w:rFonts w:hint="default"/>
+      </w:rPr>
+    </w:lvl>
+    <w:lvl w:ilvl="8">
+      <w:start w:val="1"/>
+      <w:numFmt w:val="lowerRoman"/>
+      <w:lvlText w:val="%9."/>
+      <w:lvlJc w:val="right"/>
+      <w:pPr>
+        <w:ind w:left="7189" w:hanging="180"/>
+      </w:pPr>
+      <w:rPr>
+        <w:rFonts w:hint="default"/>
+      </w:rPr>
+    </w:lvl>
+  </w:abstractNum>
+  <w:abstractNum w:abstractNumId="4" w15:restartNumberingAfterBreak="0">
+    <w:nsid w:val="1ADD3500"/>
+    <w:multiLevelType w:val="hybridMultilevel"/>
+    <w:tmpl w:val="FE78D8BE"/>
+    <w:lvl w:ilvl="0" w:tplc="580A0017">
+      <w:start w:val="1"/>
+      <w:numFmt w:val="lowerLetter"/>
+      <w:lvlText w:val="%1)"/>
+      <w:lvlJc w:val="left"/>
+      <w:pPr>
+        <w:ind w:left="720" w:hanging="360"/>
+      </w:pPr>
+    </w:lvl>
+    <w:lvl w:ilvl="1" w:tplc="580A0019" w:tentative="1">
+      <w:start w:val="1"/>
+      <w:numFmt w:val="lowerLetter"/>
+      <w:lvlText w:val="%2."/>
+      <w:lvlJc w:val="left"/>
+      <w:pPr>
+        <w:ind w:left="1440" w:hanging="360"/>
+      </w:pPr>
+    </w:lvl>
+    <w:lvl w:ilvl="2" w:tplc="580A001B" w:tentative="1">
+      <w:start w:val="1"/>
+      <w:numFmt w:val="lowerRoman"/>
+      <w:lvlText w:val="%3."/>
+      <w:lvlJc w:val="right"/>
+      <w:pPr>
+        <w:ind w:left="2160" w:hanging="180"/>
+      </w:pPr>
+    </w:lvl>
+    <w:lvl w:ilvl="3" w:tplc="580A000F" w:tentative="1">
+      <w:start w:val="1"/>
+      <w:numFmt w:val="decimal"/>
+      <w:lvlText w:val="%4."/>
+      <w:lvlJc w:val="left"/>
+      <w:pPr>
+        <w:ind w:left="2880" w:hanging="360"/>
+      </w:pPr>
+    </w:lvl>
+    <w:lvl w:ilvl="4" w:tplc="580A0019" w:tentative="1">
+      <w:start w:val="1"/>
+      <w:numFmt w:val="lowerLetter"/>
+      <w:lvlText w:val="%5."/>
+      <w:lvlJc w:val="left"/>
+      <w:pPr>
+        <w:ind w:left="3600" w:hanging="360"/>
+      </w:pPr>
+    </w:lvl>
+    <w:lvl w:ilvl="5" w:tplc="580A001B" w:tentative="1">
+      <w:start w:val="1"/>
+      <w:numFmt w:val="lowerRoman"/>
+      <w:lvlText w:val="%6."/>
+      <w:lvlJc w:val="right"/>
+      <w:pPr>
+        <w:ind w:left="4320" w:hanging="180"/>
+      </w:pPr>
+    </w:lvl>
+    <w:lvl w:ilvl="6" w:tplc="580A000F" w:tentative="1">
+      <w:start w:val="1"/>
+      <w:numFmt w:val="decimal"/>
+      <w:lvlText w:val="%7."/>
+      <w:lvlJc w:val="left"/>
+      <w:pPr>
+        <w:ind w:left="5040" w:hanging="360"/>
+      </w:pPr>
+    </w:lvl>
+    <w:lvl w:ilvl="7" w:tplc="580A0019" w:tentative="1">
+      <w:start w:val="1"/>
+      <w:numFmt w:val="lowerLetter"/>
+      <w:lvlText w:val="%8."/>
+      <w:lvlJc w:val="left"/>
+      <w:pPr>
+        <w:ind w:left="5760" w:hanging="360"/>
+      </w:pPr>
+    </w:lvl>
+    <w:lvl w:ilvl="8" w:tplc="580A001B" w:tentative="1">
+      <w:start w:val="1"/>
+      <w:numFmt w:val="lowerRoman"/>
+      <w:lvlText w:val="%9."/>
+      <w:lvlJc w:val="right"/>
+      <w:pPr>
+        <w:ind w:left="6480" w:hanging="180"/>
+      </w:pPr>
+    </w:lvl>
+  </w:abstractNum>
+  <w:abstractNum w:abstractNumId="5" w15:restartNumberingAfterBreak="0">
+    <w:nsid w:val="20B912F8"/>
+    <w:multiLevelType w:val="hybridMultilevel"/>
+    <w:tmpl w:val="EE54CBB6"/>
+    <w:lvl w:ilvl="0" w:tplc="580A0017">
+      <w:start w:val="1"/>
+      <w:numFmt w:val="lowerLetter"/>
+      <w:lvlText w:val="%1)"/>
+      <w:lvlJc w:val="left"/>
+      <w:pPr>
+        <w:ind w:left="720" w:hanging="360"/>
+      </w:pPr>
+    </w:lvl>
+    <w:lvl w:ilvl="1" w:tplc="580A0019" w:tentative="1">
+      <w:start w:val="1"/>
+      <w:numFmt w:val="lowerLetter"/>
+      <w:lvlText w:val="%2."/>
+      <w:lvlJc w:val="left"/>
+      <w:pPr>
+        <w:ind w:left="1440" w:hanging="360"/>
+      </w:pPr>
+    </w:lvl>
+    <w:lvl w:ilvl="2" w:tplc="580A001B" w:tentative="1">
+      <w:start w:val="1"/>
+      <w:numFmt w:val="lowerRoman"/>
+      <w:lvlText w:val="%3."/>
+      <w:lvlJc w:val="right"/>
+      <w:pPr>
+        <w:ind w:left="2160" w:hanging="180"/>
+      </w:pPr>
+    </w:lvl>
+    <w:lvl w:ilvl="3" w:tplc="580A000F" w:tentative="1">
+      <w:start w:val="1"/>
+      <w:numFmt w:val="decimal"/>
+      <w:lvlText w:val="%4."/>
+      <w:lvlJc w:val="left"/>
+      <w:pPr>
+        <w:ind w:left="2880" w:hanging="360"/>
+      </w:pPr>
+    </w:lvl>
+    <w:lvl w:ilvl="4" w:tplc="580A0019" w:tentative="1">
+      <w:start w:val="1"/>
+      <w:numFmt w:val="lowerLetter"/>
+      <w:lvlText w:val="%5."/>
+      <w:lvlJc w:val="left"/>
+      <w:pPr>
+        <w:ind w:left="3600" w:hanging="360"/>
+      </w:pPr>
+    </w:lvl>
+    <w:lvl w:ilvl="5" w:tplc="580A001B" w:tentative="1">
+      <w:start w:val="1"/>
+      <w:numFmt w:val="lowerRoman"/>
+      <w:lvlText w:val="%6."/>
+      <w:lvlJc w:val="right"/>
+      <w:pPr>
+        <w:ind w:left="4320" w:hanging="180"/>
+      </w:pPr>
+    </w:lvl>
+    <w:lvl w:ilvl="6" w:tplc="580A000F" w:tentative="1">
+      <w:start w:val="1"/>
+      <w:numFmt w:val="decimal"/>
+      <w:lvlText w:val="%7."/>
+      <w:lvlJc w:val="left"/>
+      <w:pPr>
+        <w:ind w:left="5040" w:hanging="360"/>
+      </w:pPr>
+    </w:lvl>
+    <w:lvl w:ilvl="7" w:tplc="580A0019" w:tentative="1">
+      <w:start w:val="1"/>
+      <w:numFmt w:val="lowerLetter"/>
+      <w:lvlText w:val="%8."/>
+      <w:lvlJc w:val="left"/>
+      <w:pPr>
+        <w:ind w:left="5760" w:hanging="360"/>
+      </w:pPr>
+    </w:lvl>
+    <w:lvl w:ilvl="8" w:tplc="580A001B" w:tentative="1">
+      <w:start w:val="1"/>
+      <w:numFmt w:val="lowerRoman"/>
+      <w:lvlText w:val="%9."/>
+      <w:lvlJc w:val="right"/>
+      <w:pPr>
+        <w:ind w:left="6480" w:hanging="180"/>
+      </w:pPr>
+    </w:lvl>
+  </w:abstractNum>
+  <w:abstractNum w:abstractNumId="6" w15:restartNumberingAfterBreak="0">
+    <w:nsid w:val="24766DF4"/>
+    <w:multiLevelType w:val="hybridMultilevel"/>
+    <w:tmpl w:val="A044BEE8"/>
+    <w:lvl w:ilvl="0" w:tplc="580A0001">
+      <w:start w:val="1"/>
+      <w:numFmt w:val="bullet"/>
+      <w:lvlText w:val=""/>
+      <w:lvlJc w:val="left"/>
+      <w:pPr>
+        <w:ind w:left="720" w:hanging="360"/>
+      </w:pPr>
+      <w:rPr>
+        <w:rFonts w:ascii="Symbol" w:hAnsi="Symbol" w:hint="default"/>
+      </w:rPr>
+    </w:lvl>
+    <w:lvl w:ilvl="1" w:tplc="580A0003">
+      <w:start w:val="1"/>
+      <w:numFmt w:val="bullet"/>
+      <w:lvlText w:val="o"/>
+      <w:lvlJc w:val="left"/>
+      <w:pPr>
+        <w:ind w:left="1440" w:hanging="360"/>
+      </w:pPr>
+      <w:rPr>
+        <w:rFonts w:ascii="Courier New" w:hAnsi="Courier New" w:cs="Courier New" w:hint="default"/>
+      </w:rPr>
+    </w:lvl>
+    <w:lvl w:ilvl="2" w:tplc="580A0005" w:tentative="1">
+      <w:start w:val="1"/>
+      <w:numFmt w:val="bullet"/>
+      <w:lvlText w:val=""/>
+      <w:lvlJc w:val="left"/>
+      <w:pPr>
+        <w:ind w:left="2160" w:hanging="360"/>
+      </w:pPr>
+      <w:rPr>
+        <w:rFonts w:ascii="Wingdings" w:hAnsi="Wingdings" w:hint="default"/>
+      </w:rPr>
+    </w:lvl>
+    <w:lvl w:ilvl="3" w:tplc="580A0001" w:tentative="1">
+      <w:start w:val="1"/>
+      <w:numFmt w:val="bullet"/>
+      <w:lvlText w:val=""/>
+      <w:lvlJc w:val="left"/>
+      <w:pPr>
+        <w:ind w:left="2880" w:hanging="360"/>
+      </w:pPr>
+      <w:rPr>
+        <w:rFonts w:ascii="Symbol" w:hAnsi="Symbol" w:hint="default"/>
+      </w:rPr>
+    </w:lvl>
+    <w:lvl w:ilvl="4" w:tplc="580A0003" w:tentative="1">
+      <w:start w:val="1"/>
+      <w:numFmt w:val="bullet"/>
+      <w:lvlText w:val="o"/>
+      <w:lvlJc w:val="left"/>
+      <w:pPr>
+        <w:ind w:left="3600" w:hanging="360"/>
+      </w:pPr>
+      <w:rPr>
+        <w:rFonts w:ascii="Courier New" w:hAnsi="Courier New" w:cs="Courier New" w:hint="default"/>
+      </w:rPr>
+    </w:lvl>
+    <w:lvl w:ilvl="5" w:tplc="580A0005" w:tentative="1">
+      <w:start w:val="1"/>
+      <w:numFmt w:val="bullet"/>
+      <w:lvlText w:val=""/>
+      <w:lvlJc w:val="left"/>
+      <w:pPr>
+        <w:ind w:left="4320" w:hanging="360"/>
+      </w:pPr>
+      <w:rPr>
+        <w:rFonts w:ascii="Wingdings" w:hAnsi="Wingdings" w:hint="default"/>
+      </w:rPr>
+    </w:lvl>
+    <w:lvl w:ilvl="6" w:tplc="580A0001" w:tentative="1">
+      <w:start w:val="1"/>
+      <w:numFmt w:val="bullet"/>
+      <w:lvlText w:val=""/>
+      <w:lvlJc w:val="left"/>
+      <w:pPr>
+        <w:ind w:left="5040" w:hanging="360"/>
+      </w:pPr>
+      <w:rPr>
+        <w:rFonts w:ascii="Symbol" w:hAnsi="Symbol" w:hint="default"/>
+      </w:rPr>
+    </w:lvl>
+    <w:lvl w:ilvl="7" w:tplc="580A0003" w:tentative="1">
+      <w:start w:val="1"/>
+      <w:numFmt w:val="bullet"/>
+      <w:lvlText w:val="o"/>
+      <w:lvlJc w:val="left"/>
+      <w:pPr>
+        <w:ind w:left="5760" w:hanging="360"/>
+      </w:pPr>
+      <w:rPr>
+        <w:rFonts w:ascii="Courier New" w:hAnsi="Courier New" w:cs="Courier New" w:hint="default"/>
+      </w:rPr>
+    </w:lvl>
+    <w:lvl w:ilvl="8" w:tplc="580A0005" w:tentative="1">
+      <w:start w:val="1"/>
+      <w:numFmt w:val="bullet"/>
+      <w:lvlText w:val=""/>
+      <w:lvlJc w:val="left"/>
+      <w:pPr>
+        <w:ind w:left="6480" w:hanging="360"/>
+      </w:pPr>
+      <w:rPr>
+        <w:rFonts w:ascii="Wingdings" w:hAnsi="Wingdings" w:hint="default"/>
+      </w:rPr>
+    </w:lvl>
+  </w:abstractNum>
+  <w:abstractNum w:abstractNumId="7" w15:restartNumberingAfterBreak="0">
     <w:nsid w:val="30950C7B"/>
     <w:multiLevelType w:val="hybridMultilevel"/>
     <w:tmpl w:val="11B24C66"/>
@@ -1446,7 +3871,1309 @@
       </w:rPr>
     </w:lvl>
   </w:abstractNum>
-  <w:abstractNum w:abstractNumId="1" w15:restartNumberingAfterBreak="0">
+  <w:abstractNum w:abstractNumId="8" w15:restartNumberingAfterBreak="0">
+    <w:nsid w:val="35B81D81"/>
+    <w:multiLevelType w:val="hybridMultilevel"/>
+    <w:tmpl w:val="7EE6A48C"/>
+    <w:lvl w:ilvl="0" w:tplc="580A0001">
+      <w:start w:val="1"/>
+      <w:numFmt w:val="bullet"/>
+      <w:lvlText w:val=""/>
+      <w:lvlJc w:val="left"/>
+      <w:pPr>
+        <w:ind w:left="360" w:hanging="360"/>
+      </w:pPr>
+      <w:rPr>
+        <w:rFonts w:ascii="Symbol" w:hAnsi="Symbol" w:hint="default"/>
+      </w:rPr>
+    </w:lvl>
+    <w:lvl w:ilvl="1" w:tplc="580A0003" w:tentative="1">
+      <w:start w:val="1"/>
+      <w:numFmt w:val="bullet"/>
+      <w:lvlText w:val="o"/>
+      <w:lvlJc w:val="left"/>
+      <w:pPr>
+        <w:ind w:left="1080" w:hanging="360"/>
+      </w:pPr>
+      <w:rPr>
+        <w:rFonts w:ascii="Courier New" w:hAnsi="Courier New" w:cs="Courier New" w:hint="default"/>
+      </w:rPr>
+    </w:lvl>
+    <w:lvl w:ilvl="2" w:tplc="580A0005" w:tentative="1">
+      <w:start w:val="1"/>
+      <w:numFmt w:val="bullet"/>
+      <w:lvlText w:val=""/>
+      <w:lvlJc w:val="left"/>
+      <w:pPr>
+        <w:ind w:left="1800" w:hanging="360"/>
+      </w:pPr>
+      <w:rPr>
+        <w:rFonts w:ascii="Wingdings" w:hAnsi="Wingdings" w:hint="default"/>
+      </w:rPr>
+    </w:lvl>
+    <w:lvl w:ilvl="3" w:tplc="580A0001" w:tentative="1">
+      <w:start w:val="1"/>
+      <w:numFmt w:val="bullet"/>
+      <w:lvlText w:val=""/>
+      <w:lvlJc w:val="left"/>
+      <w:pPr>
+        <w:ind w:left="2520" w:hanging="360"/>
+      </w:pPr>
+      <w:rPr>
+        <w:rFonts w:ascii="Symbol" w:hAnsi="Symbol" w:hint="default"/>
+      </w:rPr>
+    </w:lvl>
+    <w:lvl w:ilvl="4" w:tplc="580A0003" w:tentative="1">
+      <w:start w:val="1"/>
+      <w:numFmt w:val="bullet"/>
+      <w:lvlText w:val="o"/>
+      <w:lvlJc w:val="left"/>
+      <w:pPr>
+        <w:ind w:left="3240" w:hanging="360"/>
+      </w:pPr>
+      <w:rPr>
+        <w:rFonts w:ascii="Courier New" w:hAnsi="Courier New" w:cs="Courier New" w:hint="default"/>
+      </w:rPr>
+    </w:lvl>
+    <w:lvl w:ilvl="5" w:tplc="580A0005" w:tentative="1">
+      <w:start w:val="1"/>
+      <w:numFmt w:val="bullet"/>
+      <w:lvlText w:val=""/>
+      <w:lvlJc w:val="left"/>
+      <w:pPr>
+        <w:ind w:left="3960" w:hanging="360"/>
+      </w:pPr>
+      <w:rPr>
+        <w:rFonts w:ascii="Wingdings" w:hAnsi="Wingdings" w:hint="default"/>
+      </w:rPr>
+    </w:lvl>
+    <w:lvl w:ilvl="6" w:tplc="580A0001" w:tentative="1">
+      <w:start w:val="1"/>
+      <w:numFmt w:val="bullet"/>
+      <w:lvlText w:val=""/>
+      <w:lvlJc w:val="left"/>
+      <w:pPr>
+        <w:ind w:left="4680" w:hanging="360"/>
+      </w:pPr>
+      <w:rPr>
+        <w:rFonts w:ascii="Symbol" w:hAnsi="Symbol" w:hint="default"/>
+      </w:rPr>
+    </w:lvl>
+    <w:lvl w:ilvl="7" w:tplc="580A0003" w:tentative="1">
+      <w:start w:val="1"/>
+      <w:numFmt w:val="bullet"/>
+      <w:lvlText w:val="o"/>
+      <w:lvlJc w:val="left"/>
+      <w:pPr>
+        <w:ind w:left="5400" w:hanging="360"/>
+      </w:pPr>
+      <w:rPr>
+        <w:rFonts w:ascii="Courier New" w:hAnsi="Courier New" w:cs="Courier New" w:hint="default"/>
+      </w:rPr>
+    </w:lvl>
+    <w:lvl w:ilvl="8" w:tplc="580A0005" w:tentative="1">
+      <w:start w:val="1"/>
+      <w:numFmt w:val="bullet"/>
+      <w:lvlText w:val=""/>
+      <w:lvlJc w:val="left"/>
+      <w:pPr>
+        <w:ind w:left="6120" w:hanging="360"/>
+      </w:pPr>
+      <w:rPr>
+        <w:rFonts w:ascii="Wingdings" w:hAnsi="Wingdings" w:hint="default"/>
+      </w:rPr>
+    </w:lvl>
+  </w:abstractNum>
+  <w:abstractNum w:abstractNumId="9" w15:restartNumberingAfterBreak="0">
+    <w:nsid w:val="38444247"/>
+    <w:multiLevelType w:val="hybridMultilevel"/>
+    <w:tmpl w:val="A59CF296"/>
+    <w:lvl w:ilvl="0" w:tplc="580A0001">
+      <w:start w:val="1"/>
+      <w:numFmt w:val="bullet"/>
+      <w:lvlText w:val=""/>
+      <w:lvlJc w:val="left"/>
+      <w:pPr>
+        <w:ind w:left="1015" w:hanging="360"/>
+      </w:pPr>
+      <w:rPr>
+        <w:rFonts w:ascii="Symbol" w:hAnsi="Symbol" w:hint="default"/>
+      </w:rPr>
+    </w:lvl>
+    <w:lvl w:ilvl="1" w:tplc="580A0003" w:tentative="1">
+      <w:start w:val="1"/>
+      <w:numFmt w:val="bullet"/>
+      <w:lvlText w:val="o"/>
+      <w:lvlJc w:val="left"/>
+      <w:pPr>
+        <w:ind w:left="1735" w:hanging="360"/>
+      </w:pPr>
+      <w:rPr>
+        <w:rFonts w:ascii="Courier New" w:hAnsi="Courier New" w:cs="Courier New" w:hint="default"/>
+      </w:rPr>
+    </w:lvl>
+    <w:lvl w:ilvl="2" w:tplc="580A0005" w:tentative="1">
+      <w:start w:val="1"/>
+      <w:numFmt w:val="bullet"/>
+      <w:lvlText w:val=""/>
+      <w:lvlJc w:val="left"/>
+      <w:pPr>
+        <w:ind w:left="2455" w:hanging="360"/>
+      </w:pPr>
+      <w:rPr>
+        <w:rFonts w:ascii="Wingdings" w:hAnsi="Wingdings" w:hint="default"/>
+      </w:rPr>
+    </w:lvl>
+    <w:lvl w:ilvl="3" w:tplc="580A0001" w:tentative="1">
+      <w:start w:val="1"/>
+      <w:numFmt w:val="bullet"/>
+      <w:lvlText w:val=""/>
+      <w:lvlJc w:val="left"/>
+      <w:pPr>
+        <w:ind w:left="3175" w:hanging="360"/>
+      </w:pPr>
+      <w:rPr>
+        <w:rFonts w:ascii="Symbol" w:hAnsi="Symbol" w:hint="default"/>
+      </w:rPr>
+    </w:lvl>
+    <w:lvl w:ilvl="4" w:tplc="580A0003" w:tentative="1">
+      <w:start w:val="1"/>
+      <w:numFmt w:val="bullet"/>
+      <w:lvlText w:val="o"/>
+      <w:lvlJc w:val="left"/>
+      <w:pPr>
+        <w:ind w:left="3895" w:hanging="360"/>
+      </w:pPr>
+      <w:rPr>
+        <w:rFonts w:ascii="Courier New" w:hAnsi="Courier New" w:cs="Courier New" w:hint="default"/>
+      </w:rPr>
+    </w:lvl>
+    <w:lvl w:ilvl="5" w:tplc="580A0005" w:tentative="1">
+      <w:start w:val="1"/>
+      <w:numFmt w:val="bullet"/>
+      <w:lvlText w:val=""/>
+      <w:lvlJc w:val="left"/>
+      <w:pPr>
+        <w:ind w:left="4615" w:hanging="360"/>
+      </w:pPr>
+      <w:rPr>
+        <w:rFonts w:ascii="Wingdings" w:hAnsi="Wingdings" w:hint="default"/>
+      </w:rPr>
+    </w:lvl>
+    <w:lvl w:ilvl="6" w:tplc="580A0001" w:tentative="1">
+      <w:start w:val="1"/>
+      <w:numFmt w:val="bullet"/>
+      <w:lvlText w:val=""/>
+      <w:lvlJc w:val="left"/>
+      <w:pPr>
+        <w:ind w:left="5335" w:hanging="360"/>
+      </w:pPr>
+      <w:rPr>
+        <w:rFonts w:ascii="Symbol" w:hAnsi="Symbol" w:hint="default"/>
+      </w:rPr>
+    </w:lvl>
+    <w:lvl w:ilvl="7" w:tplc="580A0003" w:tentative="1">
+      <w:start w:val="1"/>
+      <w:numFmt w:val="bullet"/>
+      <w:lvlText w:val="o"/>
+      <w:lvlJc w:val="left"/>
+      <w:pPr>
+        <w:ind w:left="6055" w:hanging="360"/>
+      </w:pPr>
+      <w:rPr>
+        <w:rFonts w:ascii="Courier New" w:hAnsi="Courier New" w:cs="Courier New" w:hint="default"/>
+      </w:rPr>
+    </w:lvl>
+    <w:lvl w:ilvl="8" w:tplc="580A0005" w:tentative="1">
+      <w:start w:val="1"/>
+      <w:numFmt w:val="bullet"/>
+      <w:lvlText w:val=""/>
+      <w:lvlJc w:val="left"/>
+      <w:pPr>
+        <w:ind w:left="6775" w:hanging="360"/>
+      </w:pPr>
+      <w:rPr>
+        <w:rFonts w:ascii="Wingdings" w:hAnsi="Wingdings" w:hint="default"/>
+      </w:rPr>
+    </w:lvl>
+  </w:abstractNum>
+  <w:abstractNum w:abstractNumId="10" w15:restartNumberingAfterBreak="0">
+    <w:nsid w:val="410649F9"/>
+    <w:multiLevelType w:val="multilevel"/>
+    <w:tmpl w:val="985EDF44"/>
+    <w:lvl w:ilvl="0">
+      <w:start w:val="1"/>
+      <w:numFmt w:val="upperLetter"/>
+      <w:lvlText w:val="%1."/>
+      <w:lvlJc w:val="left"/>
+      <w:pPr>
+        <w:ind w:left="1429" w:hanging="360"/>
+      </w:pPr>
+      <w:rPr>
+        <w:rFonts w:hint="default"/>
+      </w:rPr>
+    </w:lvl>
+    <w:lvl w:ilvl="1">
+      <w:start w:val="1"/>
+      <w:numFmt w:val="bullet"/>
+      <w:lvlText w:val=""/>
+      <w:lvlJc w:val="left"/>
+      <w:pPr>
+        <w:ind w:left="2149" w:hanging="360"/>
+      </w:pPr>
+      <w:rPr>
+        <w:rFonts w:ascii="Symbol" w:hAnsi="Symbol" w:hint="default"/>
+      </w:rPr>
+    </w:lvl>
+    <w:lvl w:ilvl="2">
+      <w:start w:val="1"/>
+      <w:numFmt w:val="lowerRoman"/>
+      <w:lvlText w:val="%3."/>
+      <w:lvlJc w:val="right"/>
+      <w:pPr>
+        <w:ind w:left="2869" w:hanging="180"/>
+      </w:pPr>
+      <w:rPr>
+        <w:rFonts w:hint="default"/>
+      </w:rPr>
+    </w:lvl>
+    <w:lvl w:ilvl="3">
+      <w:start w:val="1"/>
+      <w:numFmt w:val="decimal"/>
+      <w:lvlText w:val="%4."/>
+      <w:lvlJc w:val="left"/>
+      <w:pPr>
+        <w:ind w:left="3589" w:hanging="360"/>
+      </w:pPr>
+      <w:rPr>
+        <w:rFonts w:hint="default"/>
+      </w:rPr>
+    </w:lvl>
+    <w:lvl w:ilvl="4">
+      <w:start w:val="1"/>
+      <w:numFmt w:val="lowerLetter"/>
+      <w:lvlText w:val="%5."/>
+      <w:lvlJc w:val="left"/>
+      <w:pPr>
+        <w:ind w:left="4309" w:hanging="360"/>
+      </w:pPr>
+      <w:rPr>
+        <w:rFonts w:hint="default"/>
+      </w:rPr>
+    </w:lvl>
+    <w:lvl w:ilvl="5">
+      <w:start w:val="1"/>
+      <w:numFmt w:val="lowerRoman"/>
+      <w:lvlText w:val="%6."/>
+      <w:lvlJc w:val="right"/>
+      <w:pPr>
+        <w:ind w:left="5029" w:hanging="180"/>
+      </w:pPr>
+      <w:rPr>
+        <w:rFonts w:hint="default"/>
+      </w:rPr>
+    </w:lvl>
+    <w:lvl w:ilvl="6">
+      <w:start w:val="1"/>
+      <w:numFmt w:val="decimal"/>
+      <w:lvlText w:val="%7."/>
+      <w:lvlJc w:val="left"/>
+      <w:pPr>
+        <w:ind w:left="5749" w:hanging="360"/>
+      </w:pPr>
+      <w:rPr>
+        <w:rFonts w:hint="default"/>
+      </w:rPr>
+    </w:lvl>
+    <w:lvl w:ilvl="7">
+      <w:start w:val="1"/>
+      <w:numFmt w:val="lowerLetter"/>
+      <w:lvlText w:val="%8."/>
+      <w:lvlJc w:val="left"/>
+      <w:pPr>
+        <w:ind w:left="6469" w:hanging="360"/>
+      </w:pPr>
+      <w:rPr>
+        <w:rFonts w:hint="default"/>
+      </w:rPr>
+    </w:lvl>
+    <w:lvl w:ilvl="8">
+      <w:start w:val="1"/>
+      <w:numFmt w:val="lowerRoman"/>
+      <w:lvlText w:val="%9."/>
+      <w:lvlJc w:val="right"/>
+      <w:pPr>
+        <w:ind w:left="7189" w:hanging="180"/>
+      </w:pPr>
+      <w:rPr>
+        <w:rFonts w:hint="default"/>
+      </w:rPr>
+    </w:lvl>
+  </w:abstractNum>
+  <w:abstractNum w:abstractNumId="11" w15:restartNumberingAfterBreak="0">
+    <w:nsid w:val="4CD262B5"/>
+    <w:multiLevelType w:val="hybridMultilevel"/>
+    <w:tmpl w:val="28E42ED4"/>
+    <w:lvl w:ilvl="0" w:tplc="580A0001">
+      <w:start w:val="1"/>
+      <w:numFmt w:val="bullet"/>
+      <w:lvlText w:val=""/>
+      <w:lvlJc w:val="left"/>
+      <w:pPr>
+        <w:ind w:left="1429" w:hanging="360"/>
+      </w:pPr>
+      <w:rPr>
+        <w:rFonts w:ascii="Symbol" w:hAnsi="Symbol" w:hint="default"/>
+      </w:rPr>
+    </w:lvl>
+    <w:lvl w:ilvl="1" w:tplc="580A0003" w:tentative="1">
+      <w:start w:val="1"/>
+      <w:numFmt w:val="bullet"/>
+      <w:lvlText w:val="o"/>
+      <w:lvlJc w:val="left"/>
+      <w:pPr>
+        <w:ind w:left="2149" w:hanging="360"/>
+      </w:pPr>
+      <w:rPr>
+        <w:rFonts w:ascii="Courier New" w:hAnsi="Courier New" w:cs="Courier New" w:hint="default"/>
+      </w:rPr>
+    </w:lvl>
+    <w:lvl w:ilvl="2" w:tplc="580A0005" w:tentative="1">
+      <w:start w:val="1"/>
+      <w:numFmt w:val="bullet"/>
+      <w:lvlText w:val=""/>
+      <w:lvlJc w:val="left"/>
+      <w:pPr>
+        <w:ind w:left="2869" w:hanging="360"/>
+      </w:pPr>
+      <w:rPr>
+        <w:rFonts w:ascii="Wingdings" w:hAnsi="Wingdings" w:hint="default"/>
+      </w:rPr>
+    </w:lvl>
+    <w:lvl w:ilvl="3" w:tplc="580A0001" w:tentative="1">
+      <w:start w:val="1"/>
+      <w:numFmt w:val="bullet"/>
+      <w:lvlText w:val=""/>
+      <w:lvlJc w:val="left"/>
+      <w:pPr>
+        <w:ind w:left="3589" w:hanging="360"/>
+      </w:pPr>
+      <w:rPr>
+        <w:rFonts w:ascii="Symbol" w:hAnsi="Symbol" w:hint="default"/>
+      </w:rPr>
+    </w:lvl>
+    <w:lvl w:ilvl="4" w:tplc="580A0003" w:tentative="1">
+      <w:start w:val="1"/>
+      <w:numFmt w:val="bullet"/>
+      <w:lvlText w:val="o"/>
+      <w:lvlJc w:val="left"/>
+      <w:pPr>
+        <w:ind w:left="4309" w:hanging="360"/>
+      </w:pPr>
+      <w:rPr>
+        <w:rFonts w:ascii="Courier New" w:hAnsi="Courier New" w:cs="Courier New" w:hint="default"/>
+      </w:rPr>
+    </w:lvl>
+    <w:lvl w:ilvl="5" w:tplc="580A0005" w:tentative="1">
+      <w:start w:val="1"/>
+      <w:numFmt w:val="bullet"/>
+      <w:lvlText w:val=""/>
+      <w:lvlJc w:val="left"/>
+      <w:pPr>
+        <w:ind w:left="5029" w:hanging="360"/>
+      </w:pPr>
+      <w:rPr>
+        <w:rFonts w:ascii="Wingdings" w:hAnsi="Wingdings" w:hint="default"/>
+      </w:rPr>
+    </w:lvl>
+    <w:lvl w:ilvl="6" w:tplc="580A0001" w:tentative="1">
+      <w:start w:val="1"/>
+      <w:numFmt w:val="bullet"/>
+      <w:lvlText w:val=""/>
+      <w:lvlJc w:val="left"/>
+      <w:pPr>
+        <w:ind w:left="5749" w:hanging="360"/>
+      </w:pPr>
+      <w:rPr>
+        <w:rFonts w:ascii="Symbol" w:hAnsi="Symbol" w:hint="default"/>
+      </w:rPr>
+    </w:lvl>
+    <w:lvl w:ilvl="7" w:tplc="580A0003" w:tentative="1">
+      <w:start w:val="1"/>
+      <w:numFmt w:val="bullet"/>
+      <w:lvlText w:val="o"/>
+      <w:lvlJc w:val="left"/>
+      <w:pPr>
+        <w:ind w:left="6469" w:hanging="360"/>
+      </w:pPr>
+      <w:rPr>
+        <w:rFonts w:ascii="Courier New" w:hAnsi="Courier New" w:cs="Courier New" w:hint="default"/>
+      </w:rPr>
+    </w:lvl>
+    <w:lvl w:ilvl="8" w:tplc="580A0005" w:tentative="1">
+      <w:start w:val="1"/>
+      <w:numFmt w:val="bullet"/>
+      <w:lvlText w:val=""/>
+      <w:lvlJc w:val="left"/>
+      <w:pPr>
+        <w:ind w:left="7189" w:hanging="360"/>
+      </w:pPr>
+      <w:rPr>
+        <w:rFonts w:ascii="Wingdings" w:hAnsi="Wingdings" w:hint="default"/>
+      </w:rPr>
+    </w:lvl>
+  </w:abstractNum>
+  <w:abstractNum w:abstractNumId="12" w15:restartNumberingAfterBreak="0">
+    <w:nsid w:val="4D377E35"/>
+    <w:multiLevelType w:val="hybridMultilevel"/>
+    <w:tmpl w:val="F89E6A1E"/>
+    <w:lvl w:ilvl="0" w:tplc="580A0015">
+      <w:start w:val="1"/>
+      <w:numFmt w:val="upperLetter"/>
+      <w:lvlText w:val="%1."/>
+      <w:lvlJc w:val="left"/>
+      <w:pPr>
+        <w:ind w:left="720" w:hanging="360"/>
+      </w:pPr>
+    </w:lvl>
+    <w:lvl w:ilvl="1" w:tplc="580A0019" w:tentative="1">
+      <w:start w:val="1"/>
+      <w:numFmt w:val="lowerLetter"/>
+      <w:lvlText w:val="%2."/>
+      <w:lvlJc w:val="left"/>
+      <w:pPr>
+        <w:ind w:left="1440" w:hanging="360"/>
+      </w:pPr>
+    </w:lvl>
+    <w:lvl w:ilvl="2" w:tplc="580A001B" w:tentative="1">
+      <w:start w:val="1"/>
+      <w:numFmt w:val="lowerRoman"/>
+      <w:lvlText w:val="%3."/>
+      <w:lvlJc w:val="right"/>
+      <w:pPr>
+        <w:ind w:left="2160" w:hanging="180"/>
+      </w:pPr>
+    </w:lvl>
+    <w:lvl w:ilvl="3" w:tplc="580A000F" w:tentative="1">
+      <w:start w:val="1"/>
+      <w:numFmt w:val="decimal"/>
+      <w:lvlText w:val="%4."/>
+      <w:lvlJc w:val="left"/>
+      <w:pPr>
+        <w:ind w:left="2880" w:hanging="360"/>
+      </w:pPr>
+    </w:lvl>
+    <w:lvl w:ilvl="4" w:tplc="580A0019" w:tentative="1">
+      <w:start w:val="1"/>
+      <w:numFmt w:val="lowerLetter"/>
+      <w:lvlText w:val="%5."/>
+      <w:lvlJc w:val="left"/>
+      <w:pPr>
+        <w:ind w:left="3600" w:hanging="360"/>
+      </w:pPr>
+    </w:lvl>
+    <w:lvl w:ilvl="5" w:tplc="580A001B" w:tentative="1">
+      <w:start w:val="1"/>
+      <w:numFmt w:val="lowerRoman"/>
+      <w:lvlText w:val="%6."/>
+      <w:lvlJc w:val="right"/>
+      <w:pPr>
+        <w:ind w:left="4320" w:hanging="180"/>
+      </w:pPr>
+    </w:lvl>
+    <w:lvl w:ilvl="6" w:tplc="580A000F" w:tentative="1">
+      <w:start w:val="1"/>
+      <w:numFmt w:val="decimal"/>
+      <w:lvlText w:val="%7."/>
+      <w:lvlJc w:val="left"/>
+      <w:pPr>
+        <w:ind w:left="5040" w:hanging="360"/>
+      </w:pPr>
+    </w:lvl>
+    <w:lvl w:ilvl="7" w:tplc="580A0019" w:tentative="1">
+      <w:start w:val="1"/>
+      <w:numFmt w:val="lowerLetter"/>
+      <w:lvlText w:val="%8."/>
+      <w:lvlJc w:val="left"/>
+      <w:pPr>
+        <w:ind w:left="5760" w:hanging="360"/>
+      </w:pPr>
+    </w:lvl>
+    <w:lvl w:ilvl="8" w:tplc="580A001B" w:tentative="1">
+      <w:start w:val="1"/>
+      <w:numFmt w:val="lowerRoman"/>
+      <w:lvlText w:val="%9."/>
+      <w:lvlJc w:val="right"/>
+      <w:pPr>
+        <w:ind w:left="6480" w:hanging="180"/>
+      </w:pPr>
+    </w:lvl>
+  </w:abstractNum>
+  <w:abstractNum w:abstractNumId="13" w15:restartNumberingAfterBreak="0">
+    <w:nsid w:val="56E85A1D"/>
+    <w:multiLevelType w:val="hybridMultilevel"/>
+    <w:tmpl w:val="8522DE7E"/>
+    <w:lvl w:ilvl="0" w:tplc="580A0017">
+      <w:start w:val="1"/>
+      <w:numFmt w:val="lowerLetter"/>
+      <w:lvlText w:val="%1)"/>
+      <w:lvlJc w:val="left"/>
+      <w:pPr>
+        <w:ind w:left="720" w:hanging="360"/>
+      </w:pPr>
+    </w:lvl>
+    <w:lvl w:ilvl="1" w:tplc="580A0019" w:tentative="1">
+      <w:start w:val="1"/>
+      <w:numFmt w:val="lowerLetter"/>
+      <w:lvlText w:val="%2."/>
+      <w:lvlJc w:val="left"/>
+      <w:pPr>
+        <w:ind w:left="1440" w:hanging="360"/>
+      </w:pPr>
+    </w:lvl>
+    <w:lvl w:ilvl="2" w:tplc="580A001B" w:tentative="1">
+      <w:start w:val="1"/>
+      <w:numFmt w:val="lowerRoman"/>
+      <w:lvlText w:val="%3."/>
+      <w:lvlJc w:val="right"/>
+      <w:pPr>
+        <w:ind w:left="2160" w:hanging="180"/>
+      </w:pPr>
+    </w:lvl>
+    <w:lvl w:ilvl="3" w:tplc="580A000F" w:tentative="1">
+      <w:start w:val="1"/>
+      <w:numFmt w:val="decimal"/>
+      <w:lvlText w:val="%4."/>
+      <w:lvlJc w:val="left"/>
+      <w:pPr>
+        <w:ind w:left="2880" w:hanging="360"/>
+      </w:pPr>
+    </w:lvl>
+    <w:lvl w:ilvl="4" w:tplc="580A0019" w:tentative="1">
+      <w:start w:val="1"/>
+      <w:numFmt w:val="lowerLetter"/>
+      <w:lvlText w:val="%5."/>
+      <w:lvlJc w:val="left"/>
+      <w:pPr>
+        <w:ind w:left="3600" w:hanging="360"/>
+      </w:pPr>
+    </w:lvl>
+    <w:lvl w:ilvl="5" w:tplc="580A001B" w:tentative="1">
+      <w:start w:val="1"/>
+      <w:numFmt w:val="lowerRoman"/>
+      <w:lvlText w:val="%6."/>
+      <w:lvlJc w:val="right"/>
+      <w:pPr>
+        <w:ind w:left="4320" w:hanging="180"/>
+      </w:pPr>
+    </w:lvl>
+    <w:lvl w:ilvl="6" w:tplc="580A000F" w:tentative="1">
+      <w:start w:val="1"/>
+      <w:numFmt w:val="decimal"/>
+      <w:lvlText w:val="%7."/>
+      <w:lvlJc w:val="left"/>
+      <w:pPr>
+        <w:ind w:left="5040" w:hanging="360"/>
+      </w:pPr>
+    </w:lvl>
+    <w:lvl w:ilvl="7" w:tplc="580A0019" w:tentative="1">
+      <w:start w:val="1"/>
+      <w:numFmt w:val="lowerLetter"/>
+      <w:lvlText w:val="%8."/>
+      <w:lvlJc w:val="left"/>
+      <w:pPr>
+        <w:ind w:left="5760" w:hanging="360"/>
+      </w:pPr>
+    </w:lvl>
+    <w:lvl w:ilvl="8" w:tplc="580A001B" w:tentative="1">
+      <w:start w:val="1"/>
+      <w:numFmt w:val="lowerRoman"/>
+      <w:lvlText w:val="%9."/>
+      <w:lvlJc w:val="right"/>
+      <w:pPr>
+        <w:ind w:left="6480" w:hanging="180"/>
+      </w:pPr>
+    </w:lvl>
+  </w:abstractNum>
+  <w:abstractNum w:abstractNumId="14" w15:restartNumberingAfterBreak="0">
+    <w:nsid w:val="58225A27"/>
+    <w:multiLevelType w:val="hybridMultilevel"/>
+    <w:tmpl w:val="893671C0"/>
+    <w:lvl w:ilvl="0" w:tplc="580A0001">
+      <w:start w:val="1"/>
+      <w:numFmt w:val="bullet"/>
+      <w:lvlText w:val=""/>
+      <w:lvlJc w:val="left"/>
+      <w:pPr>
+        <w:ind w:left="1068" w:hanging="360"/>
+      </w:pPr>
+      <w:rPr>
+        <w:rFonts w:ascii="Symbol" w:hAnsi="Symbol" w:hint="default"/>
+      </w:rPr>
+    </w:lvl>
+    <w:lvl w:ilvl="1" w:tplc="580A0003" w:tentative="1">
+      <w:start w:val="1"/>
+      <w:numFmt w:val="bullet"/>
+      <w:lvlText w:val="o"/>
+      <w:lvlJc w:val="left"/>
+      <w:pPr>
+        <w:ind w:left="1788" w:hanging="360"/>
+      </w:pPr>
+      <w:rPr>
+        <w:rFonts w:ascii="Courier New" w:hAnsi="Courier New" w:cs="Courier New" w:hint="default"/>
+      </w:rPr>
+    </w:lvl>
+    <w:lvl w:ilvl="2" w:tplc="580A0005" w:tentative="1">
+      <w:start w:val="1"/>
+      <w:numFmt w:val="bullet"/>
+      <w:lvlText w:val=""/>
+      <w:lvlJc w:val="left"/>
+      <w:pPr>
+        <w:ind w:left="2508" w:hanging="360"/>
+      </w:pPr>
+      <w:rPr>
+        <w:rFonts w:ascii="Wingdings" w:hAnsi="Wingdings" w:hint="default"/>
+      </w:rPr>
+    </w:lvl>
+    <w:lvl w:ilvl="3" w:tplc="580A0001" w:tentative="1">
+      <w:start w:val="1"/>
+      <w:numFmt w:val="bullet"/>
+      <w:lvlText w:val=""/>
+      <w:lvlJc w:val="left"/>
+      <w:pPr>
+        <w:ind w:left="3228" w:hanging="360"/>
+      </w:pPr>
+      <w:rPr>
+        <w:rFonts w:ascii="Symbol" w:hAnsi="Symbol" w:hint="default"/>
+      </w:rPr>
+    </w:lvl>
+    <w:lvl w:ilvl="4" w:tplc="580A0003" w:tentative="1">
+      <w:start w:val="1"/>
+      <w:numFmt w:val="bullet"/>
+      <w:lvlText w:val="o"/>
+      <w:lvlJc w:val="left"/>
+      <w:pPr>
+        <w:ind w:left="3948" w:hanging="360"/>
+      </w:pPr>
+      <w:rPr>
+        <w:rFonts w:ascii="Courier New" w:hAnsi="Courier New" w:cs="Courier New" w:hint="default"/>
+      </w:rPr>
+    </w:lvl>
+    <w:lvl w:ilvl="5" w:tplc="580A0005" w:tentative="1">
+      <w:start w:val="1"/>
+      <w:numFmt w:val="bullet"/>
+      <w:lvlText w:val=""/>
+      <w:lvlJc w:val="left"/>
+      <w:pPr>
+        <w:ind w:left="4668" w:hanging="360"/>
+      </w:pPr>
+      <w:rPr>
+        <w:rFonts w:ascii="Wingdings" w:hAnsi="Wingdings" w:hint="default"/>
+      </w:rPr>
+    </w:lvl>
+    <w:lvl w:ilvl="6" w:tplc="580A0001" w:tentative="1">
+      <w:start w:val="1"/>
+      <w:numFmt w:val="bullet"/>
+      <w:lvlText w:val=""/>
+      <w:lvlJc w:val="left"/>
+      <w:pPr>
+        <w:ind w:left="5388" w:hanging="360"/>
+      </w:pPr>
+      <w:rPr>
+        <w:rFonts w:ascii="Symbol" w:hAnsi="Symbol" w:hint="default"/>
+      </w:rPr>
+    </w:lvl>
+    <w:lvl w:ilvl="7" w:tplc="580A0003" w:tentative="1">
+      <w:start w:val="1"/>
+      <w:numFmt w:val="bullet"/>
+      <w:lvlText w:val="o"/>
+      <w:lvlJc w:val="left"/>
+      <w:pPr>
+        <w:ind w:left="6108" w:hanging="360"/>
+      </w:pPr>
+      <w:rPr>
+        <w:rFonts w:ascii="Courier New" w:hAnsi="Courier New" w:cs="Courier New" w:hint="default"/>
+      </w:rPr>
+    </w:lvl>
+    <w:lvl w:ilvl="8" w:tplc="580A0005" w:tentative="1">
+      <w:start w:val="1"/>
+      <w:numFmt w:val="bullet"/>
+      <w:lvlText w:val=""/>
+      <w:lvlJc w:val="left"/>
+      <w:pPr>
+        <w:ind w:left="6828" w:hanging="360"/>
+      </w:pPr>
+      <w:rPr>
+        <w:rFonts w:ascii="Wingdings" w:hAnsi="Wingdings" w:hint="default"/>
+      </w:rPr>
+    </w:lvl>
+  </w:abstractNum>
+  <w:abstractNum w:abstractNumId="15" w15:restartNumberingAfterBreak="0">
+    <w:nsid w:val="60392D69"/>
+    <w:multiLevelType w:val="hybridMultilevel"/>
+    <w:tmpl w:val="A6AA3D6C"/>
+    <w:lvl w:ilvl="0" w:tplc="580A0003">
+      <w:start w:val="1"/>
+      <w:numFmt w:val="bullet"/>
+      <w:lvlText w:val="o"/>
+      <w:lvlJc w:val="left"/>
+      <w:pPr>
+        <w:ind w:left="360" w:hanging="360"/>
+      </w:pPr>
+      <w:rPr>
+        <w:rFonts w:ascii="Courier New" w:hAnsi="Courier New" w:cs="Courier New" w:hint="default"/>
+      </w:rPr>
+    </w:lvl>
+    <w:lvl w:ilvl="1" w:tplc="580A0003" w:tentative="1">
+      <w:start w:val="1"/>
+      <w:numFmt w:val="bullet"/>
+      <w:lvlText w:val="o"/>
+      <w:lvlJc w:val="left"/>
+      <w:pPr>
+        <w:ind w:left="1080" w:hanging="360"/>
+      </w:pPr>
+      <w:rPr>
+        <w:rFonts w:ascii="Courier New" w:hAnsi="Courier New" w:cs="Courier New" w:hint="default"/>
+      </w:rPr>
+    </w:lvl>
+    <w:lvl w:ilvl="2" w:tplc="580A0005" w:tentative="1">
+      <w:start w:val="1"/>
+      <w:numFmt w:val="bullet"/>
+      <w:lvlText w:val=""/>
+      <w:lvlJc w:val="left"/>
+      <w:pPr>
+        <w:ind w:left="1800" w:hanging="360"/>
+      </w:pPr>
+      <w:rPr>
+        <w:rFonts w:ascii="Wingdings" w:hAnsi="Wingdings" w:hint="default"/>
+      </w:rPr>
+    </w:lvl>
+    <w:lvl w:ilvl="3" w:tplc="580A0001" w:tentative="1">
+      <w:start w:val="1"/>
+      <w:numFmt w:val="bullet"/>
+      <w:lvlText w:val=""/>
+      <w:lvlJc w:val="left"/>
+      <w:pPr>
+        <w:ind w:left="2520" w:hanging="360"/>
+      </w:pPr>
+      <w:rPr>
+        <w:rFonts w:ascii="Symbol" w:hAnsi="Symbol" w:hint="default"/>
+      </w:rPr>
+    </w:lvl>
+    <w:lvl w:ilvl="4" w:tplc="580A0003" w:tentative="1">
+      <w:start w:val="1"/>
+      <w:numFmt w:val="bullet"/>
+      <w:lvlText w:val="o"/>
+      <w:lvlJc w:val="left"/>
+      <w:pPr>
+        <w:ind w:left="3240" w:hanging="360"/>
+      </w:pPr>
+      <w:rPr>
+        <w:rFonts w:ascii="Courier New" w:hAnsi="Courier New" w:cs="Courier New" w:hint="default"/>
+      </w:rPr>
+    </w:lvl>
+    <w:lvl w:ilvl="5" w:tplc="580A0005" w:tentative="1">
+      <w:start w:val="1"/>
+      <w:numFmt w:val="bullet"/>
+      <w:lvlText w:val=""/>
+      <w:lvlJc w:val="left"/>
+      <w:pPr>
+        <w:ind w:left="3960" w:hanging="360"/>
+      </w:pPr>
+      <w:rPr>
+        <w:rFonts w:ascii="Wingdings" w:hAnsi="Wingdings" w:hint="default"/>
+      </w:rPr>
+    </w:lvl>
+    <w:lvl w:ilvl="6" w:tplc="580A0001" w:tentative="1">
+      <w:start w:val="1"/>
+      <w:numFmt w:val="bullet"/>
+      <w:lvlText w:val=""/>
+      <w:lvlJc w:val="left"/>
+      <w:pPr>
+        <w:ind w:left="4680" w:hanging="360"/>
+      </w:pPr>
+      <w:rPr>
+        <w:rFonts w:ascii="Symbol" w:hAnsi="Symbol" w:hint="default"/>
+      </w:rPr>
+    </w:lvl>
+    <w:lvl w:ilvl="7" w:tplc="580A0003" w:tentative="1">
+      <w:start w:val="1"/>
+      <w:numFmt w:val="bullet"/>
+      <w:lvlText w:val="o"/>
+      <w:lvlJc w:val="left"/>
+      <w:pPr>
+        <w:ind w:left="5400" w:hanging="360"/>
+      </w:pPr>
+      <w:rPr>
+        <w:rFonts w:ascii="Courier New" w:hAnsi="Courier New" w:cs="Courier New" w:hint="default"/>
+      </w:rPr>
+    </w:lvl>
+    <w:lvl w:ilvl="8" w:tplc="580A0005" w:tentative="1">
+      <w:start w:val="1"/>
+      <w:numFmt w:val="bullet"/>
+      <w:lvlText w:val=""/>
+      <w:lvlJc w:val="left"/>
+      <w:pPr>
+        <w:ind w:left="6120" w:hanging="360"/>
+      </w:pPr>
+      <w:rPr>
+        <w:rFonts w:ascii="Wingdings" w:hAnsi="Wingdings" w:hint="default"/>
+      </w:rPr>
+    </w:lvl>
+  </w:abstractNum>
+  <w:abstractNum w:abstractNumId="16" w15:restartNumberingAfterBreak="0">
+    <w:nsid w:val="62E9581D"/>
+    <w:multiLevelType w:val="hybridMultilevel"/>
+    <w:tmpl w:val="21A297AC"/>
+    <w:lvl w:ilvl="0" w:tplc="580A0001">
+      <w:start w:val="1"/>
+      <w:numFmt w:val="bullet"/>
+      <w:lvlText w:val=""/>
+      <w:lvlJc w:val="left"/>
+      <w:pPr>
+        <w:ind w:left="1776" w:hanging="360"/>
+      </w:pPr>
+      <w:rPr>
+        <w:rFonts w:ascii="Symbol" w:hAnsi="Symbol" w:hint="default"/>
+      </w:rPr>
+    </w:lvl>
+    <w:lvl w:ilvl="1" w:tplc="580A0003">
+      <w:start w:val="1"/>
+      <w:numFmt w:val="bullet"/>
+      <w:lvlText w:val="o"/>
+      <w:lvlJc w:val="left"/>
+      <w:pPr>
+        <w:ind w:left="2496" w:hanging="360"/>
+      </w:pPr>
+      <w:rPr>
+        <w:rFonts w:ascii="Courier New" w:hAnsi="Courier New" w:cs="Courier New" w:hint="default"/>
+      </w:rPr>
+    </w:lvl>
+    <w:lvl w:ilvl="2" w:tplc="580A0005" w:tentative="1">
+      <w:start w:val="1"/>
+      <w:numFmt w:val="bullet"/>
+      <w:lvlText w:val=""/>
+      <w:lvlJc w:val="left"/>
+      <w:pPr>
+        <w:ind w:left="3216" w:hanging="360"/>
+      </w:pPr>
+      <w:rPr>
+        <w:rFonts w:ascii="Wingdings" w:hAnsi="Wingdings" w:hint="default"/>
+      </w:rPr>
+    </w:lvl>
+    <w:lvl w:ilvl="3" w:tplc="580A0001" w:tentative="1">
+      <w:start w:val="1"/>
+      <w:numFmt w:val="bullet"/>
+      <w:lvlText w:val=""/>
+      <w:lvlJc w:val="left"/>
+      <w:pPr>
+        <w:ind w:left="3936" w:hanging="360"/>
+      </w:pPr>
+      <w:rPr>
+        <w:rFonts w:ascii="Symbol" w:hAnsi="Symbol" w:hint="default"/>
+      </w:rPr>
+    </w:lvl>
+    <w:lvl w:ilvl="4" w:tplc="580A0003" w:tentative="1">
+      <w:start w:val="1"/>
+      <w:numFmt w:val="bullet"/>
+      <w:lvlText w:val="o"/>
+      <w:lvlJc w:val="left"/>
+      <w:pPr>
+        <w:ind w:left="4656" w:hanging="360"/>
+      </w:pPr>
+      <w:rPr>
+        <w:rFonts w:ascii="Courier New" w:hAnsi="Courier New" w:cs="Courier New" w:hint="default"/>
+      </w:rPr>
+    </w:lvl>
+    <w:lvl w:ilvl="5" w:tplc="580A0005" w:tentative="1">
+      <w:start w:val="1"/>
+      <w:numFmt w:val="bullet"/>
+      <w:lvlText w:val=""/>
+      <w:lvlJc w:val="left"/>
+      <w:pPr>
+        <w:ind w:left="5376" w:hanging="360"/>
+      </w:pPr>
+      <w:rPr>
+        <w:rFonts w:ascii="Wingdings" w:hAnsi="Wingdings" w:hint="default"/>
+      </w:rPr>
+    </w:lvl>
+    <w:lvl w:ilvl="6" w:tplc="580A0001" w:tentative="1">
+      <w:start w:val="1"/>
+      <w:numFmt w:val="bullet"/>
+      <w:lvlText w:val=""/>
+      <w:lvlJc w:val="left"/>
+      <w:pPr>
+        <w:ind w:left="6096" w:hanging="360"/>
+      </w:pPr>
+      <w:rPr>
+        <w:rFonts w:ascii="Symbol" w:hAnsi="Symbol" w:hint="default"/>
+      </w:rPr>
+    </w:lvl>
+    <w:lvl w:ilvl="7" w:tplc="580A0003" w:tentative="1">
+      <w:start w:val="1"/>
+      <w:numFmt w:val="bullet"/>
+      <w:lvlText w:val="o"/>
+      <w:lvlJc w:val="left"/>
+      <w:pPr>
+        <w:ind w:left="6816" w:hanging="360"/>
+      </w:pPr>
+      <w:rPr>
+        <w:rFonts w:ascii="Courier New" w:hAnsi="Courier New" w:cs="Courier New" w:hint="default"/>
+      </w:rPr>
+    </w:lvl>
+    <w:lvl w:ilvl="8" w:tplc="580A0005" w:tentative="1">
+      <w:start w:val="1"/>
+      <w:numFmt w:val="bullet"/>
+      <w:lvlText w:val=""/>
+      <w:lvlJc w:val="left"/>
+      <w:pPr>
+        <w:ind w:left="7536" w:hanging="360"/>
+      </w:pPr>
+      <w:rPr>
+        <w:rFonts w:ascii="Wingdings" w:hAnsi="Wingdings" w:hint="default"/>
+      </w:rPr>
+    </w:lvl>
+  </w:abstractNum>
+  <w:abstractNum w:abstractNumId="17" w15:restartNumberingAfterBreak="0">
+    <w:nsid w:val="633D5C35"/>
+    <w:multiLevelType w:val="hybridMultilevel"/>
+    <w:tmpl w:val="718EB73C"/>
+    <w:lvl w:ilvl="0" w:tplc="580A0001">
+      <w:start w:val="1"/>
+      <w:numFmt w:val="bullet"/>
+      <w:lvlText w:val=""/>
+      <w:lvlJc w:val="left"/>
+      <w:pPr>
+        <w:ind w:left="2484" w:hanging="360"/>
+      </w:pPr>
+      <w:rPr>
+        <w:rFonts w:ascii="Symbol" w:hAnsi="Symbol" w:hint="default"/>
+      </w:rPr>
+    </w:lvl>
+    <w:lvl w:ilvl="1" w:tplc="580A0003" w:tentative="1">
+      <w:start w:val="1"/>
+      <w:numFmt w:val="bullet"/>
+      <w:lvlText w:val="o"/>
+      <w:lvlJc w:val="left"/>
+      <w:pPr>
+        <w:ind w:left="3204" w:hanging="360"/>
+      </w:pPr>
+      <w:rPr>
+        <w:rFonts w:ascii="Courier New" w:hAnsi="Courier New" w:cs="Courier New" w:hint="default"/>
+      </w:rPr>
+    </w:lvl>
+    <w:lvl w:ilvl="2" w:tplc="580A0005" w:tentative="1">
+      <w:start w:val="1"/>
+      <w:numFmt w:val="bullet"/>
+      <w:lvlText w:val=""/>
+      <w:lvlJc w:val="left"/>
+      <w:pPr>
+        <w:ind w:left="3924" w:hanging="360"/>
+      </w:pPr>
+      <w:rPr>
+        <w:rFonts w:ascii="Wingdings" w:hAnsi="Wingdings" w:hint="default"/>
+      </w:rPr>
+    </w:lvl>
+    <w:lvl w:ilvl="3" w:tplc="580A0001" w:tentative="1">
+      <w:start w:val="1"/>
+      <w:numFmt w:val="bullet"/>
+      <w:lvlText w:val=""/>
+      <w:lvlJc w:val="left"/>
+      <w:pPr>
+        <w:ind w:left="4644" w:hanging="360"/>
+      </w:pPr>
+      <w:rPr>
+        <w:rFonts w:ascii="Symbol" w:hAnsi="Symbol" w:hint="default"/>
+      </w:rPr>
+    </w:lvl>
+    <w:lvl w:ilvl="4" w:tplc="580A0003" w:tentative="1">
+      <w:start w:val="1"/>
+      <w:numFmt w:val="bullet"/>
+      <w:lvlText w:val="o"/>
+      <w:lvlJc w:val="left"/>
+      <w:pPr>
+        <w:ind w:left="5364" w:hanging="360"/>
+      </w:pPr>
+      <w:rPr>
+        <w:rFonts w:ascii="Courier New" w:hAnsi="Courier New" w:cs="Courier New" w:hint="default"/>
+      </w:rPr>
+    </w:lvl>
+    <w:lvl w:ilvl="5" w:tplc="580A0005" w:tentative="1">
+      <w:start w:val="1"/>
+      <w:numFmt w:val="bullet"/>
+      <w:lvlText w:val=""/>
+      <w:lvlJc w:val="left"/>
+      <w:pPr>
+        <w:ind w:left="6084" w:hanging="360"/>
+      </w:pPr>
+      <w:rPr>
+        <w:rFonts w:ascii="Wingdings" w:hAnsi="Wingdings" w:hint="default"/>
+      </w:rPr>
+    </w:lvl>
+    <w:lvl w:ilvl="6" w:tplc="580A0001" w:tentative="1">
+      <w:start w:val="1"/>
+      <w:numFmt w:val="bullet"/>
+      <w:lvlText w:val=""/>
+      <w:lvlJc w:val="left"/>
+      <w:pPr>
+        <w:ind w:left="6804" w:hanging="360"/>
+      </w:pPr>
+      <w:rPr>
+        <w:rFonts w:ascii="Symbol" w:hAnsi="Symbol" w:hint="default"/>
+      </w:rPr>
+    </w:lvl>
+    <w:lvl w:ilvl="7" w:tplc="580A0003" w:tentative="1">
+      <w:start w:val="1"/>
+      <w:numFmt w:val="bullet"/>
+      <w:lvlText w:val="o"/>
+      <w:lvlJc w:val="left"/>
+      <w:pPr>
+        <w:ind w:left="7524" w:hanging="360"/>
+      </w:pPr>
+      <w:rPr>
+        <w:rFonts w:ascii="Courier New" w:hAnsi="Courier New" w:cs="Courier New" w:hint="default"/>
+      </w:rPr>
+    </w:lvl>
+    <w:lvl w:ilvl="8" w:tplc="580A0005" w:tentative="1">
+      <w:start w:val="1"/>
+      <w:numFmt w:val="bullet"/>
+      <w:lvlText w:val=""/>
+      <w:lvlJc w:val="left"/>
+      <w:pPr>
+        <w:ind w:left="8244" w:hanging="360"/>
+      </w:pPr>
+      <w:rPr>
+        <w:rFonts w:ascii="Wingdings" w:hAnsi="Wingdings" w:hint="default"/>
+      </w:rPr>
+    </w:lvl>
+  </w:abstractNum>
+  <w:abstractNum w:abstractNumId="18" w15:restartNumberingAfterBreak="0">
+    <w:nsid w:val="6C5C4121"/>
+    <w:multiLevelType w:val="hybridMultilevel"/>
+    <w:tmpl w:val="684CB7E6"/>
+    <w:lvl w:ilvl="0" w:tplc="580A0001">
+      <w:start w:val="1"/>
+      <w:numFmt w:val="bullet"/>
+      <w:lvlText w:val=""/>
+      <w:lvlJc w:val="left"/>
+      <w:pPr>
+        <w:ind w:left="360" w:hanging="360"/>
+      </w:pPr>
+      <w:rPr>
+        <w:rFonts w:ascii="Symbol" w:hAnsi="Symbol" w:hint="default"/>
+      </w:rPr>
+    </w:lvl>
+    <w:lvl w:ilvl="1" w:tplc="580A0003" w:tentative="1">
+      <w:start w:val="1"/>
+      <w:numFmt w:val="bullet"/>
+      <w:lvlText w:val="o"/>
+      <w:lvlJc w:val="left"/>
+      <w:pPr>
+        <w:ind w:left="1080" w:hanging="360"/>
+      </w:pPr>
+      <w:rPr>
+        <w:rFonts w:ascii="Courier New" w:hAnsi="Courier New" w:cs="Courier New" w:hint="default"/>
+      </w:rPr>
+    </w:lvl>
+    <w:lvl w:ilvl="2" w:tplc="580A0005" w:tentative="1">
+      <w:start w:val="1"/>
+      <w:numFmt w:val="bullet"/>
+      <w:lvlText w:val=""/>
+      <w:lvlJc w:val="left"/>
+      <w:pPr>
+        <w:ind w:left="1800" w:hanging="360"/>
+      </w:pPr>
+      <w:rPr>
+        <w:rFonts w:ascii="Wingdings" w:hAnsi="Wingdings" w:hint="default"/>
+      </w:rPr>
+    </w:lvl>
+    <w:lvl w:ilvl="3" w:tplc="580A0001" w:tentative="1">
+      <w:start w:val="1"/>
+      <w:numFmt w:val="bullet"/>
+      <w:lvlText w:val=""/>
+      <w:lvlJc w:val="left"/>
+      <w:pPr>
+        <w:ind w:left="2520" w:hanging="360"/>
+      </w:pPr>
+      <w:rPr>
+        <w:rFonts w:ascii="Symbol" w:hAnsi="Symbol" w:hint="default"/>
+      </w:rPr>
+    </w:lvl>
+    <w:lvl w:ilvl="4" w:tplc="580A0003" w:tentative="1">
+      <w:start w:val="1"/>
+      <w:numFmt w:val="bullet"/>
+      <w:lvlText w:val="o"/>
+      <w:lvlJc w:val="left"/>
+      <w:pPr>
+        <w:ind w:left="3240" w:hanging="360"/>
+      </w:pPr>
+      <w:rPr>
+        <w:rFonts w:ascii="Courier New" w:hAnsi="Courier New" w:cs="Courier New" w:hint="default"/>
+      </w:rPr>
+    </w:lvl>
+    <w:lvl w:ilvl="5" w:tplc="580A0005" w:tentative="1">
+      <w:start w:val="1"/>
+      <w:numFmt w:val="bullet"/>
+      <w:lvlText w:val=""/>
+      <w:lvlJc w:val="left"/>
+      <w:pPr>
+        <w:ind w:left="3960" w:hanging="360"/>
+      </w:pPr>
+      <w:rPr>
+        <w:rFonts w:ascii="Wingdings" w:hAnsi="Wingdings" w:hint="default"/>
+      </w:rPr>
+    </w:lvl>
+    <w:lvl w:ilvl="6" w:tplc="580A0001" w:tentative="1">
+      <w:start w:val="1"/>
+      <w:numFmt w:val="bullet"/>
+      <w:lvlText w:val=""/>
+      <w:lvlJc w:val="left"/>
+      <w:pPr>
+        <w:ind w:left="4680" w:hanging="360"/>
+      </w:pPr>
+      <w:rPr>
+        <w:rFonts w:ascii="Symbol" w:hAnsi="Symbol" w:hint="default"/>
+      </w:rPr>
+    </w:lvl>
+    <w:lvl w:ilvl="7" w:tplc="580A0003" w:tentative="1">
+      <w:start w:val="1"/>
+      <w:numFmt w:val="bullet"/>
+      <w:lvlText w:val="o"/>
+      <w:lvlJc w:val="left"/>
+      <w:pPr>
+        <w:ind w:left="5400" w:hanging="360"/>
+      </w:pPr>
+      <w:rPr>
+        <w:rFonts w:ascii="Courier New" w:hAnsi="Courier New" w:cs="Courier New" w:hint="default"/>
+      </w:rPr>
+    </w:lvl>
+    <w:lvl w:ilvl="8" w:tplc="580A0005" w:tentative="1">
+      <w:start w:val="1"/>
+      <w:numFmt w:val="bullet"/>
+      <w:lvlText w:val=""/>
+      <w:lvlJc w:val="left"/>
+      <w:pPr>
+        <w:ind w:left="6120" w:hanging="360"/>
+      </w:pPr>
+      <w:rPr>
+        <w:rFonts w:ascii="Wingdings" w:hAnsi="Wingdings" w:hint="default"/>
+      </w:rPr>
+    </w:lvl>
+  </w:abstractNum>
+  <w:abstractNum w:abstractNumId="19" w15:restartNumberingAfterBreak="0">
+    <w:nsid w:val="76710D3D"/>
+    <w:multiLevelType w:val="hybridMultilevel"/>
+    <w:tmpl w:val="DAE8AA40"/>
+    <w:lvl w:ilvl="0" w:tplc="580A0003">
+      <w:start w:val="1"/>
+      <w:numFmt w:val="bullet"/>
+      <w:lvlText w:val="o"/>
+      <w:lvlJc w:val="left"/>
+      <w:pPr>
+        <w:ind w:left="360" w:hanging="360"/>
+      </w:pPr>
+      <w:rPr>
+        <w:rFonts w:ascii="Courier New" w:hAnsi="Courier New" w:cs="Courier New" w:hint="default"/>
+      </w:rPr>
+    </w:lvl>
+    <w:lvl w:ilvl="1" w:tplc="580A0003" w:tentative="1">
+      <w:start w:val="1"/>
+      <w:numFmt w:val="bullet"/>
+      <w:lvlText w:val="o"/>
+      <w:lvlJc w:val="left"/>
+      <w:pPr>
+        <w:ind w:left="1080" w:hanging="360"/>
+      </w:pPr>
+      <w:rPr>
+        <w:rFonts w:ascii="Courier New" w:hAnsi="Courier New" w:cs="Courier New" w:hint="default"/>
+      </w:rPr>
+    </w:lvl>
+    <w:lvl w:ilvl="2" w:tplc="580A0005" w:tentative="1">
+      <w:start w:val="1"/>
+      <w:numFmt w:val="bullet"/>
+      <w:lvlText w:val=""/>
+      <w:lvlJc w:val="left"/>
+      <w:pPr>
+        <w:ind w:left="1800" w:hanging="360"/>
+      </w:pPr>
+      <w:rPr>
+        <w:rFonts w:ascii="Wingdings" w:hAnsi="Wingdings" w:hint="default"/>
+      </w:rPr>
+    </w:lvl>
+    <w:lvl w:ilvl="3" w:tplc="580A0001" w:tentative="1">
+      <w:start w:val="1"/>
+      <w:numFmt w:val="bullet"/>
+      <w:lvlText w:val=""/>
+      <w:lvlJc w:val="left"/>
+      <w:pPr>
+        <w:ind w:left="2520" w:hanging="360"/>
+      </w:pPr>
+      <w:rPr>
+        <w:rFonts w:ascii="Symbol" w:hAnsi="Symbol" w:hint="default"/>
+      </w:rPr>
+    </w:lvl>
+    <w:lvl w:ilvl="4" w:tplc="580A0003" w:tentative="1">
+      <w:start w:val="1"/>
+      <w:numFmt w:val="bullet"/>
+      <w:lvlText w:val="o"/>
+      <w:lvlJc w:val="left"/>
+      <w:pPr>
+        <w:ind w:left="3240" w:hanging="360"/>
+      </w:pPr>
+      <w:rPr>
+        <w:rFonts w:ascii="Courier New" w:hAnsi="Courier New" w:cs="Courier New" w:hint="default"/>
+      </w:rPr>
+    </w:lvl>
+    <w:lvl w:ilvl="5" w:tplc="580A0005" w:tentative="1">
+      <w:start w:val="1"/>
+      <w:numFmt w:val="bullet"/>
+      <w:lvlText w:val=""/>
+      <w:lvlJc w:val="left"/>
+      <w:pPr>
+        <w:ind w:left="3960" w:hanging="360"/>
+      </w:pPr>
+      <w:rPr>
+        <w:rFonts w:ascii="Wingdings" w:hAnsi="Wingdings" w:hint="default"/>
+      </w:rPr>
+    </w:lvl>
+    <w:lvl w:ilvl="6" w:tplc="580A0001" w:tentative="1">
+      <w:start w:val="1"/>
+      <w:numFmt w:val="bullet"/>
+      <w:lvlText w:val=""/>
+      <w:lvlJc w:val="left"/>
+      <w:pPr>
+        <w:ind w:left="4680" w:hanging="360"/>
+      </w:pPr>
+      <w:rPr>
+        <w:rFonts w:ascii="Symbol" w:hAnsi="Symbol" w:hint="default"/>
+      </w:rPr>
+    </w:lvl>
+    <w:lvl w:ilvl="7" w:tplc="580A0003" w:tentative="1">
+      <w:start w:val="1"/>
+      <w:numFmt w:val="bullet"/>
+      <w:lvlText w:val="o"/>
+      <w:lvlJc w:val="left"/>
+      <w:pPr>
+        <w:ind w:left="5400" w:hanging="360"/>
+      </w:pPr>
+      <w:rPr>
+        <w:rFonts w:ascii="Courier New" w:hAnsi="Courier New" w:cs="Courier New" w:hint="default"/>
+      </w:rPr>
+    </w:lvl>
+    <w:lvl w:ilvl="8" w:tplc="580A0005" w:tentative="1">
+      <w:start w:val="1"/>
+      <w:numFmt w:val="bullet"/>
+      <w:lvlText w:val=""/>
+      <w:lvlJc w:val="left"/>
+      <w:pPr>
+        <w:ind w:left="6120" w:hanging="360"/>
+      </w:pPr>
+      <w:rPr>
+        <w:rFonts w:ascii="Wingdings" w:hAnsi="Wingdings" w:hint="default"/>
+      </w:rPr>
+    </w:lvl>
+  </w:abstractNum>
+  <w:abstractNum w:abstractNumId="20" w15:restartNumberingAfterBreak="0">
     <w:nsid w:val="7B0A7386"/>
     <w:multiLevelType w:val="hybridMultilevel"/>
     <w:tmpl w:val="63B811CE"/>
@@ -1560,10 +5287,67 @@
     </w:lvl>
   </w:abstractNum>
   <w:num w:numId="1">
+    <w:abstractNumId w:val="20"/>
+  </w:num>
+  <w:num w:numId="2">
+    <w:abstractNumId w:val="7"/>
+  </w:num>
+  <w:num w:numId="3">
+    <w:abstractNumId w:val="6"/>
+  </w:num>
+  <w:num w:numId="4">
+    <w:abstractNumId w:val="15"/>
+  </w:num>
+  <w:num w:numId="5">
+    <w:abstractNumId w:val="18"/>
+  </w:num>
+  <w:num w:numId="6">
+    <w:abstractNumId w:val="0"/>
+  </w:num>
+  <w:num w:numId="7">
+    <w:abstractNumId w:val="17"/>
+  </w:num>
+  <w:num w:numId="8">
+    <w:abstractNumId w:val="19"/>
+  </w:num>
+  <w:num w:numId="9">
+    <w:abstractNumId w:val="8"/>
+  </w:num>
+  <w:num w:numId="10">
+    <w:abstractNumId w:val="2"/>
+  </w:num>
+  <w:num w:numId="11">
+    <w:abstractNumId w:val="14"/>
+  </w:num>
+  <w:num w:numId="12">
+    <w:abstractNumId w:val="10"/>
+  </w:num>
+  <w:num w:numId="13">
     <w:abstractNumId w:val="1"/>
   </w:num>
-  <w:num w:numId="2">
-    <w:abstractNumId w:val="0"/>
+  <w:num w:numId="14">
+    <w:abstractNumId w:val="9"/>
+  </w:num>
+  <w:num w:numId="15">
+    <w:abstractNumId w:val="11"/>
+  </w:num>
+  <w:num w:numId="16">
+    <w:abstractNumId w:val="4"/>
+  </w:num>
+  <w:num w:numId="17">
+    <w:abstractNumId w:val="5"/>
+  </w:num>
+  <w:num w:numId="18">
+    <w:abstractNumId w:val="13"/>
+  </w:num>
+  <w:num w:numId="19">
+    <w:abstractNumId w:val="12"/>
+  </w:num>
+  <w:num w:numId="20">
+    <w:abstractNumId w:val="16"/>
+  </w:num>
+  <w:num w:numId="21">
+    <w:abstractNumId w:val="3"/>
   </w:num>
 </w:numbering>
 </file>
@@ -1961,7 +5745,7 @@
   <w:style w:type="paragraph" w:default="1" w:styleId="Normal">
     <w:name w:val="Normal"/>
     <w:qFormat/>
-    <w:rsid w:val="00862A33"/>
+    <w:rsid w:val="00297656"/>
   </w:style>
   <w:style w:type="character" w:default="1" w:styleId="Fuentedeprrafopredeter">
     <w:name w:val="Default Paragraph Font"/>
@@ -2019,6 +5803,19 @@
       <w:ind w:left="720"/>
       <w:contextualSpacing/>
     </w:pPr>
+  </w:style>
+  <w:style w:type="character" w:styleId="CdigoHTML">
+    <w:name w:val="HTML Code"/>
+    <w:basedOn w:val="Fuentedeprrafopredeter"/>
+    <w:uiPriority w:val="99"/>
+    <w:semiHidden/>
+    <w:unhideWhenUsed/>
+    <w:rsid w:val="00AE7704"/>
+    <w:rPr>
+      <w:rFonts w:ascii="Courier New" w:eastAsia="Times New Roman" w:hAnsi="Courier New" w:cs="Courier New"/>
+      <w:sz w:val="20"/>
+      <w:szCs w:val="20"/>
+    </w:rPr>
   </w:style>
 </w:styles>
 </file>

</xml_diff>